<commit_message>
fix: update_pipeline_doc.js 파일명 수정 + 구성도 현행화
- 구버전 파일명(step1_claude_code.md 등) → _검수포함/_전자동 분리된 실제 파일명으로 수정
- 파이프라인 흐름 테이블: RUN_ID 디렉토리 구조, sample_docs, 검수 UI 반영
- 지시문 관리 테이블: review_server.js, latest_run 포인터, sample_docs 항목 추가
- 파일 흐름도 테이블: $RUN_ID 경로, latest_run, 검수 UI 단계 추가
- docs/qa_pipeline_구성도.docx 재생성

Co-Authored-By: Claude Sonnet 4.6 <noreply@anthropic.com>
</commit_message>
<xml_diff>
--- a/docs/qa_pipeline_구성도.docx
+++ b/docs/qa_pipeline_구성도.docx
@@ -97,8 +97,8 @@
         </w:tblBorders>
       </w:tblPr>
       <w:tblGrid>
-        <w:gridCol w:w="3600"/>
-        <w:gridCol w:w="5426"/>
+        <w:gridCol w:w="3000"/>
+        <w:gridCol w:w="6026"/>
       </w:tblGrid>
       <w:tr>
         <w:trPr>
@@ -106,7 +106,7 @@
         </w:trPr>
         <w:tc>
           <w:tcPr>
-            <w:tcW w:type="dxa" w:w="3600"/>
+            <w:tcW w:type="dxa" w:w="3000"/>
             <w:tcBorders>
               <w:top w:val="single" w:color="4472C4" w:sz="1"/>
               <w:left w:val="single" w:color="4472C4" w:sz="1"/>
@@ -137,7 +137,7 @@
         </w:tc>
         <w:tc>
           <w:tcPr>
-            <w:tcW w:type="dxa" w:w="5426"/>
+            <w:tcW w:type="dxa" w:w="6026"/>
             <w:tcBorders>
               <w:top w:val="single" w:color="4472C4" w:sz="1"/>
               <w:left w:val="single" w:color="4472C4" w:sz="1"/>
@@ -170,7 +170,7 @@
       <w:tr>
         <w:tc>
           <w:tcPr>
-            <w:tcW w:type="dxa" w:w="3600"/>
+            <w:tcW w:type="dxa" w:w="3000"/>
             <w:tcBorders>
               <w:top w:val="single" w:color="CCCCCC" w:sz="1"/>
               <w:left w:val="single" w:color="CCCCCC" w:sz="1"/>
@@ -198,7 +198,7 @@
         </w:tc>
         <w:tc>
           <w:tcPr>
-            <w:tcW w:type="dxa" w:w="5426"/>
+            <w:tcW w:type="dxa" w:w="6026"/>
             <w:tcBorders>
               <w:top w:val="single" w:color="CCCCCC" w:sz="1"/>
               <w:left w:val="single" w:color="CCCCCC" w:sz="1"/>
@@ -228,7 +228,7 @@
       <w:tr>
         <w:tc>
           <w:tcPr>
-            <w:tcW w:type="dxa" w:w="3600"/>
+            <w:tcW w:type="dxa" w:w="3000"/>
             <w:tcBorders>
               <w:top w:val="single" w:color="CCCCCC" w:sz="1"/>
               <w:left w:val="single" w:color="CCCCCC" w:sz="1"/>
@@ -256,7 +256,7 @@
         </w:tc>
         <w:tc>
           <w:tcPr>
-            <w:tcW w:type="dxa" w:w="5426"/>
+            <w:tcW w:type="dxa" w:w="6026"/>
             <w:tcBorders>
               <w:top w:val="single" w:color="CCCCCC" w:sz="1"/>
               <w:left w:val="single" w:color="CCCCCC" w:sz="1"/>
@@ -286,7 +286,7 @@
       <w:tr>
         <w:tc>
           <w:tcPr>
-            <w:tcW w:type="dxa" w:w="3600"/>
+            <w:tcW w:type="dxa" w:w="3000"/>
             <w:tcBorders>
               <w:top w:val="single" w:color="CCCCCC" w:sz="1"/>
               <w:left w:val="single" w:color="CCCCCC" w:sz="1"/>
@@ -314,7 +314,7 @@
         </w:tc>
         <w:tc>
           <w:tcPr>
-            <w:tcW w:type="dxa" w:w="5426"/>
+            <w:tcW w:type="dxa" w:w="6026"/>
             <w:tcBorders>
               <w:top w:val="single" w:color="CCCCCC" w:sz="1"/>
               <w:left w:val="single" w:color="CCCCCC" w:sz="1"/>
@@ -344,7 +344,7 @@
       <w:tr>
         <w:tc>
           <w:tcPr>
-            <w:tcW w:type="dxa" w:w="3600"/>
+            <w:tcW w:type="dxa" w:w="3000"/>
             <w:tcBorders>
               <w:top w:val="single" w:color="CCCCCC" w:sz="1"/>
               <w:left w:val="single" w:color="CCCCCC" w:sz="1"/>
@@ -372,7 +372,7 @@
         </w:tc>
         <w:tc>
           <w:tcPr>
-            <w:tcW w:type="dxa" w:w="5426"/>
+            <w:tcW w:type="dxa" w:w="6026"/>
             <w:tcBorders>
               <w:top w:val="single" w:color="CCCCCC" w:sz="1"/>
               <w:left w:val="single" w:color="CCCCCC" w:sz="1"/>
@@ -402,7 +402,7 @@
       <w:tr>
         <w:tc>
           <w:tcPr>
-            <w:tcW w:type="dxa" w:w="3600"/>
+            <w:tcW w:type="dxa" w:w="3000"/>
             <w:tcBorders>
               <w:top w:val="single" w:color="CCCCCC" w:sz="1"/>
               <w:left w:val="single" w:color="CCCCCC" w:sz="1"/>
@@ -430,7 +430,7 @@
         </w:tc>
         <w:tc>
           <w:tcPr>
-            <w:tcW w:type="dxa" w:w="5426"/>
+            <w:tcW w:type="dxa" w:w="6026"/>
             <w:tcBorders>
               <w:top w:val="single" w:color="CCCCCC" w:sz="1"/>
               <w:left w:val="single" w:color="CCCCCC" w:sz="1"/>
@@ -460,7 +460,7 @@
       <w:tr>
         <w:tc>
           <w:tcPr>
-            <w:tcW w:type="dxa" w:w="3600"/>
+            <w:tcW w:type="dxa" w:w="3000"/>
             <w:tcBorders>
               <w:top w:val="single" w:color="CCCCCC" w:sz="1"/>
               <w:left w:val="single" w:color="CCCCCC" w:sz="1"/>
@@ -488,29 +488,29 @@
         </w:tc>
         <w:tc>
           <w:tcPr>
-            <w:tcW w:type="dxa" w:w="5426"/>
-            <w:tcBorders>
-              <w:top w:val="single" w:color="CCCCCC" w:sz="1"/>
-              <w:left w:val="single" w:color="CCCCCC" w:sz="1"/>
-              <w:bottom w:val="single" w:color="CCCCCC" w:sz="1"/>
-              <w:right w:val="single" w:color="CCCCCC" w:sz="1"/>
-            </w:tcBorders>
-            <w:shd w:fill="FFFFFF" w:val="clear"/>
-            <w:tcMar>
-              <w:top w:type="dxa" w:w="80"/>
-              <w:left w:type="dxa" w:w="120"/>
-              <w:bottom w:type="dxa" w:w="80"/>
-              <w:right w:type="dxa" w:w="120"/>
-            </w:tcMar>
-          </w:tcPr>
-          <w:p>
-            <w:r>
-              <w:rPr>
-                <w:rFonts w:ascii="Apple SD Gothic Neo" w:cs="Apple SD Gothic Neo" w:eastAsia="Apple SD Gothic Neo" w:hAnsi="Apple SD Gothic Neo"/>
-                <w:sz w:val="19"/>
-                <w:szCs w:val="19"/>
-              </w:rPr>
-              <w:t xml:space="preserve">instructions/ 폴더 MD 파일</w:t>
+            <w:tcW w:type="dxa" w:w="6026"/>
+            <w:tcBorders>
+              <w:top w:val="single" w:color="CCCCCC" w:sz="1"/>
+              <w:left w:val="single" w:color="CCCCCC" w:sz="1"/>
+              <w:bottom w:val="single" w:color="CCCCCC" w:sz="1"/>
+              <w:right w:val="single" w:color="CCCCCC" w:sz="1"/>
+            </w:tcBorders>
+            <w:shd w:fill="FFFFFF" w:val="clear"/>
+            <w:tcMar>
+              <w:top w:type="dxa" w:w="80"/>
+              <w:left w:type="dxa" w:w="120"/>
+              <w:bottom w:type="dxa" w:w="80"/>
+              <w:right w:type="dxa" w:w="120"/>
+            </w:tcMar>
+          </w:tcPr>
+          <w:p>
+            <w:r>
+              <w:rPr>
+                <w:rFonts w:ascii="Apple SD Gothic Neo" w:cs="Apple SD Gothic Neo" w:eastAsia="Apple SD Gothic Neo" w:hAnsi="Apple SD Gothic Neo"/>
+                <w:sz w:val="19"/>
+                <w:szCs w:val="19"/>
+              </w:rPr>
+              <w:t xml:space="preserve">instructions/ 폴더 MD 파일 (전자동 / 검수포함 두 버전)</w:t>
             </w:r>
           </w:p>
         </w:tc>
@@ -518,7 +518,123 @@
       <w:tr>
         <w:tc>
           <w:tcPr>
-            <w:tcW w:type="dxa" w:w="3600"/>
+            <w:tcW w:type="dxa" w:w="3000"/>
+            <w:tcBorders>
+              <w:top w:val="single" w:color="CCCCCC" w:sz="1"/>
+              <w:left w:val="single" w:color="CCCCCC" w:sz="1"/>
+              <w:bottom w:val="single" w:color="CCCCCC" w:sz="1"/>
+              <w:right w:val="single" w:color="CCCCCC" w:sz="1"/>
+            </w:tcBorders>
+            <w:shd w:fill="F5F8FF" w:val="clear"/>
+            <w:tcMar>
+              <w:top w:type="dxa" w:w="80"/>
+              <w:left w:type="dxa" w:w="120"/>
+              <w:bottom w:type="dxa" w:w="80"/>
+              <w:right w:type="dxa" w:w="120"/>
+            </w:tcMar>
+          </w:tcPr>
+          <w:p>
+            <w:r>
+              <w:rPr>
+                <w:rFonts w:ascii="Apple SD Gothic Neo" w:cs="Apple SD Gothic Neo" w:eastAsia="Apple SD Gothic Neo" w:hAnsi="Apple SD Gothic Neo"/>
+                <w:sz w:val="19"/>
+                <w:szCs w:val="19"/>
+              </w:rPr>
+              <w:t xml:space="preserve">실행 ID</w:t>
+            </w:r>
+          </w:p>
+        </w:tc>
+        <w:tc>
+          <w:tcPr>
+            <w:tcW w:type="dxa" w:w="6026"/>
+            <w:tcBorders>
+              <w:top w:val="single" w:color="CCCCCC" w:sz="1"/>
+              <w:left w:val="single" w:color="CCCCCC" w:sz="1"/>
+              <w:bottom w:val="single" w:color="CCCCCC" w:sz="1"/>
+              <w:right w:val="single" w:color="CCCCCC" w:sz="1"/>
+            </w:tcBorders>
+            <w:shd w:fill="F5F8FF" w:val="clear"/>
+            <w:tcMar>
+              <w:top w:type="dxa" w:w="80"/>
+              <w:left w:type="dxa" w:w="120"/>
+              <w:bottom w:type="dxa" w:w="80"/>
+              <w:right w:type="dxa" w:w="120"/>
+            </w:tcMar>
+          </w:tcPr>
+          <w:p>
+            <w:r>
+              <w:rPr>
+                <w:rFonts w:ascii="Apple SD Gothic Neo" w:cs="Apple SD Gothic Neo" w:eastAsia="Apple SD Gothic Neo" w:hAnsi="Apple SD Gothic Neo"/>
+                <w:sz w:val="19"/>
+                <w:szCs w:val="19"/>
+              </w:rPr>
+              <w:t xml:space="preserve">yymmddhhmm 형식 — 실행마다 별도 디렉토리로 누적 관리</w:t>
+            </w:r>
+          </w:p>
+        </w:tc>
+      </w:tr>
+      <w:tr>
+        <w:tc>
+          <w:tcPr>
+            <w:tcW w:type="dxa" w:w="3000"/>
+            <w:tcBorders>
+              <w:top w:val="single" w:color="CCCCCC" w:sz="1"/>
+              <w:left w:val="single" w:color="CCCCCC" w:sz="1"/>
+              <w:bottom w:val="single" w:color="CCCCCC" w:sz="1"/>
+              <w:right w:val="single" w:color="CCCCCC" w:sz="1"/>
+            </w:tcBorders>
+            <w:shd w:fill="FFFFFF" w:val="clear"/>
+            <w:tcMar>
+              <w:top w:type="dxa" w:w="80"/>
+              <w:left w:type="dxa" w:w="120"/>
+              <w:bottom w:type="dxa" w:w="80"/>
+              <w:right w:type="dxa" w:w="120"/>
+            </w:tcMar>
+          </w:tcPr>
+          <w:p>
+            <w:r>
+              <w:rPr>
+                <w:rFonts w:ascii="Apple SD Gothic Neo" w:cs="Apple SD Gothic Neo" w:eastAsia="Apple SD Gothic Neo" w:hAnsi="Apple SD Gothic Neo"/>
+                <w:sz w:val="19"/>
+                <w:szCs w:val="19"/>
+              </w:rPr>
+              <w:t xml:space="preserve">현재 Run 포인터</w:t>
+            </w:r>
+          </w:p>
+        </w:tc>
+        <w:tc>
+          <w:tcPr>
+            <w:tcW w:type="dxa" w:w="6026"/>
+            <w:tcBorders>
+              <w:top w:val="single" w:color="CCCCCC" w:sz="1"/>
+              <w:left w:val="single" w:color="CCCCCC" w:sz="1"/>
+              <w:bottom w:val="single" w:color="CCCCCC" w:sz="1"/>
+              <w:right w:val="single" w:color="CCCCCC" w:sz="1"/>
+            </w:tcBorders>
+            <w:shd w:fill="FFFFFF" w:val="clear"/>
+            <w:tcMar>
+              <w:top w:type="dxa" w:w="80"/>
+              <w:left w:type="dxa" w:w="120"/>
+              <w:bottom w:type="dxa" w:w="80"/>
+              <w:right w:type="dxa" w:w="120"/>
+            </w:tcMar>
+          </w:tcPr>
+          <w:p>
+            <w:r>
+              <w:rPr>
+                <w:rFonts w:ascii="Apple SD Gothic Neo" w:cs="Apple SD Gothic Neo" w:eastAsia="Apple SD Gothic Neo" w:hAnsi="Apple SD Gothic Neo"/>
+                <w:sz w:val="19"/>
+                <w:szCs w:val="19"/>
+              </w:rPr>
+              <w:t xml:space="preserve">output/latest_run — Step 1 검수 커밋 시 자동 기록</w:t>
+            </w:r>
+          </w:p>
+        </w:tc>
+      </w:tr>
+      <w:tr>
+        <w:tc>
+          <w:tcPr>
+            <w:tcW w:type="dxa" w:w="3000"/>
             <w:tcBorders>
               <w:top w:val="single" w:color="CCCCCC" w:sz="1"/>
               <w:left w:val="single" w:color="CCCCCC" w:sz="1"/>
@@ -546,29 +662,29 @@
         </w:tc>
         <w:tc>
           <w:tcPr>
-            <w:tcW w:type="dxa" w:w="5426"/>
-            <w:tcBorders>
-              <w:top w:val="single" w:color="CCCCCC" w:sz="1"/>
-              <w:left w:val="single" w:color="CCCCCC" w:sz="1"/>
-              <w:bottom w:val="single" w:color="CCCCCC" w:sz="1"/>
-              <w:right w:val="single" w:color="CCCCCC" w:sz="1"/>
-            </w:tcBorders>
-            <w:shd w:fill="F5F8FF" w:val="clear"/>
-            <w:tcMar>
-              <w:top w:type="dxa" w:w="80"/>
-              <w:left w:type="dxa" w:w="120"/>
-              <w:bottom w:type="dxa" w:w="80"/>
-              <w:right w:type="dxa" w:w="120"/>
-            </w:tcMar>
-          </w:tcPr>
-          <w:p>
-            <w:r>
-              <w:rPr>
-                <w:rFonts w:ascii="Apple SD Gothic Neo" w:cs="Apple SD Gothic Neo" w:eastAsia="Apple SD Gothic Neo" w:hAnsi="Apple SD Gothic Neo"/>
-                <w:sz w:val="19"/>
-                <w:szCs w:val="19"/>
-              </w:rPr>
-              <w:t xml:space="preserve">node scripts/update_pipeline_doc.js</w:t>
+            <w:tcW w:type="dxa" w:w="6026"/>
+            <w:tcBorders>
+              <w:top w:val="single" w:color="CCCCCC" w:sz="1"/>
+              <w:left w:val="single" w:color="CCCCCC" w:sz="1"/>
+              <w:bottom w:val="single" w:color="CCCCCC" w:sz="1"/>
+              <w:right w:val="single" w:color="CCCCCC" w:sz="1"/>
+            </w:tcBorders>
+            <w:shd w:fill="F5F8FF" w:val="clear"/>
+            <w:tcMar>
+              <w:top w:type="dxa" w:w="80"/>
+              <w:left w:type="dxa" w:w="120"/>
+              <w:bottom w:type="dxa" w:w="80"/>
+              <w:right w:type="dxa" w:w="120"/>
+            </w:tcMar>
+          </w:tcPr>
+          <w:p>
+            <w:r>
+              <w:rPr>
+                <w:rFonts w:ascii="Apple SD Gothic Neo" w:cs="Apple SD Gothic Neo" w:eastAsia="Apple SD Gothic Neo" w:hAnsi="Apple SD Gothic Neo"/>
+                <w:sz w:val="19"/>
+                <w:szCs w:val="19"/>
+              </w:rPr>
+              <w:t xml:space="preserve">node scripts/update_pipeline_doc.js (pre-commit 훅 자동 실행)</w:t>
             </w:r>
           </w:p>
         </w:tc>
@@ -613,10 +729,10 @@
       </w:tblPr>
       <w:tblGrid>
         <w:gridCol w:w="1000"/>
-        <w:gridCol w:w="1800"/>
+        <w:gridCol w:w="1600"/>
+        <w:gridCol w:w="2000"/>
         <w:gridCol w:w="2400"/>
-        <w:gridCol w:w="2200"/>
-        <w:gridCol w:w="1626"/>
+        <w:gridCol w:w="2026"/>
       </w:tblGrid>
       <w:tr>
         <w:trPr>
@@ -655,7 +771,7 @@
         </w:tc>
         <w:tc>
           <w:tcPr>
-            <w:tcW w:type="dxa" w:w="1800"/>
+            <w:tcW w:type="dxa" w:w="1600"/>
             <w:tcBorders>
               <w:top w:val="single" w:color="4472C4" w:sz="1"/>
               <w:left w:val="single" w:color="4472C4" w:sz="1"/>
@@ -686,7 +802,7 @@
         </w:tc>
         <w:tc>
           <w:tcPr>
-            <w:tcW w:type="dxa" w:w="2400"/>
+            <w:tcW w:type="dxa" w:w="2000"/>
             <w:tcBorders>
               <w:top w:val="single" w:color="4472C4" w:sz="1"/>
               <w:left w:val="single" w:color="4472C4" w:sz="1"/>
@@ -717,7 +833,7 @@
         </w:tc>
         <w:tc>
           <w:tcPr>
-            <w:tcW w:type="dxa" w:w="2200"/>
+            <w:tcW w:type="dxa" w:w="2400"/>
             <w:tcBorders>
               <w:top w:val="single" w:color="4472C4" w:sz="1"/>
               <w:left w:val="single" w:color="4472C4" w:sz="1"/>
@@ -748,7 +864,7 @@
         </w:tc>
         <w:tc>
           <w:tcPr>
-            <w:tcW w:type="dxa" w:w="1626"/>
+            <w:tcW w:type="dxa" w:w="2026"/>
             <w:tcBorders>
               <w:top w:val="single" w:color="4472C4" w:sz="1"/>
               <w:left w:val="single" w:color="4472C4" w:sz="1"/>
@@ -809,7 +925,7 @@
         </w:tc>
         <w:tc>
           <w:tcPr>
-            <w:tcW w:type="dxa" w:w="1800"/>
+            <w:tcW w:type="dxa" w:w="1600"/>
             <w:tcBorders>
               <w:top w:val="single" w:color="CCCCCC" w:sz="1"/>
               <w:left w:val="single" w:color="CCCCCC" w:sz="1"/>
@@ -837,6 +953,34 @@
         </w:tc>
         <w:tc>
           <w:tcPr>
+            <w:tcW w:type="dxa" w:w="2000"/>
+            <w:tcBorders>
+              <w:top w:val="single" w:color="CCCCCC" w:sz="1"/>
+              <w:left w:val="single" w:color="CCCCCC" w:sz="1"/>
+              <w:bottom w:val="single" w:color="CCCCCC" w:sz="1"/>
+              <w:right w:val="single" w:color="CCCCCC" w:sz="1"/>
+            </w:tcBorders>
+            <w:shd w:fill="F5F8FF" w:val="clear"/>
+            <w:tcMar>
+              <w:top w:type="dxa" w:w="80"/>
+              <w:left w:type="dxa" w:w="120"/>
+              <w:bottom w:type="dxa" w:w="80"/>
+              <w:right w:type="dxa" w:w="120"/>
+            </w:tcMar>
+          </w:tcPr>
+          <w:p>
+            <w:r>
+              <w:rPr>
+                <w:rFonts w:ascii="Apple SD Gothic Neo" w:cs="Apple SD Gothic Neo" w:eastAsia="Apple SD Gothic Neo" w:hAnsi="Apple SD Gothic Neo"/>
+                <w:sz w:val="19"/>
+                <w:szCs w:val="19"/>
+              </w:rPr>
+              <w:t xml:space="preserve">시나리오 생성</w:t>
+            </w:r>
+          </w:p>
+        </w:tc>
+        <w:tc>
+          <w:tcPr>
             <w:tcW w:type="dxa" w:w="2400"/>
             <w:tcBorders>
               <w:top w:val="single" w:color="CCCCCC" w:sz="1"/>
@@ -859,65 +1003,42 @@
                 <w:sz w:val="19"/>
                 <w:szCs w:val="19"/>
               </w:rPr>
-              <w:t xml:space="preserve">시나리오 생성</w:t>
-            </w:r>
-          </w:p>
-        </w:tc>
-        <w:tc>
-          <w:tcPr>
-            <w:tcW w:type="dxa" w:w="2200"/>
-            <w:tcBorders>
-              <w:top w:val="single" w:color="CCCCCC" w:sz="1"/>
-              <w:left w:val="single" w:color="CCCCCC" w:sz="1"/>
-              <w:bottom w:val="single" w:color="CCCCCC" w:sz="1"/>
-              <w:right w:val="single" w:color="CCCCCC" w:sz="1"/>
-            </w:tcBorders>
-            <w:shd w:fill="F5F8FF" w:val="clear"/>
-            <w:tcMar>
-              <w:top w:type="dxa" w:w="80"/>
-              <w:left w:type="dxa" w:w="120"/>
-              <w:bottom w:type="dxa" w:w="80"/>
-              <w:right w:type="dxa" w:w="120"/>
-            </w:tcMar>
-          </w:tcPr>
-          <w:p>
-            <w:r>
-              <w:rPr>
-                <w:rFonts w:ascii="Apple SD Gothic Neo" w:cs="Apple SD Gothic Neo" w:eastAsia="Apple SD Gothic Neo" w:hAnsi="Apple SD Gothic Neo"/>
-                <w:sz w:val="19"/>
-                <w:szCs w:val="19"/>
-              </w:rPr>
-              <w:t xml:space="preserve">프론트엔드 코드 zip
-Figma API</w:t>
-            </w:r>
-          </w:p>
-        </w:tc>
-        <w:tc>
-          <w:tcPr>
-            <w:tcW w:type="dxa" w:w="1626"/>
-            <w:tcBorders>
-              <w:top w:val="single" w:color="CCCCCC" w:sz="1"/>
-              <w:left w:val="single" w:color="CCCCCC" w:sz="1"/>
-              <w:bottom w:val="single" w:color="CCCCCC" w:sz="1"/>
-              <w:right w:val="single" w:color="CCCCCC" w:sz="1"/>
-            </w:tcBorders>
-            <w:shd w:fill="F5F8FF" w:val="clear"/>
-            <w:tcMar>
-              <w:top w:type="dxa" w:w="80"/>
-              <w:left w:type="dxa" w:w="120"/>
-              <w:bottom w:type="dxa" w:w="80"/>
-              <w:right w:type="dxa" w:w="120"/>
-            </w:tcMar>
-          </w:tcPr>
-          <w:p>
-            <w:r>
-              <w:rPr>
-                <w:rFonts w:ascii="Apple SD Gothic Neo" w:cs="Apple SD Gothic Neo" w:eastAsia="Apple SD Gothic Neo" w:hAnsi="Apple SD Gothic Neo"/>
-                <w:sz w:val="19"/>
-                <w:szCs w:val="19"/>
-              </w:rPr>
-              <w:t xml:space="preserve">qa_scenarios.csv
-qa_definition.md</w:t>
+              <w:t xml:space="preserve">input/frontend_code/ (zip)
+input/figma_frames/$RUN_ID/
+input/sample_docs/ (PDF)</w:t>
+            </w:r>
+          </w:p>
+        </w:tc>
+        <w:tc>
+          <w:tcPr>
+            <w:tcW w:type="dxa" w:w="2026"/>
+            <w:tcBorders>
+              <w:top w:val="single" w:color="CCCCCC" w:sz="1"/>
+              <w:left w:val="single" w:color="CCCCCC" w:sz="1"/>
+              <w:bottom w:val="single" w:color="CCCCCC" w:sz="1"/>
+              <w:right w:val="single" w:color="CCCCCC" w:sz="1"/>
+            </w:tcBorders>
+            <w:shd w:fill="F5F8FF" w:val="clear"/>
+            <w:tcMar>
+              <w:top w:type="dxa" w:w="80"/>
+              <w:left w:type="dxa" w:w="120"/>
+              <w:bottom w:type="dxa" w:w="80"/>
+              <w:right w:type="dxa" w:w="120"/>
+            </w:tcMar>
+          </w:tcPr>
+          <w:p>
+            <w:r>
+              <w:rPr>
+                <w:rFonts w:ascii="Apple SD Gothic Neo" w:cs="Apple SD Gothic Neo" w:eastAsia="Apple SD Gothic Neo" w:hAnsi="Apple SD Gothic Neo"/>
+                <w:sz w:val="19"/>
+                <w:szCs w:val="19"/>
+              </w:rPr>
+              <w:t xml:space="preserve">output/step1/$RUN_ID/
+  qa_scenarios.csv
+  qa_definition.md
+  spec_draft.md
+  mismatch_report.md
+output/step1/run_log.md</w:t>
             </w:r>
           </w:p>
         </w:tc>
@@ -947,20 +1068,164 @@
                 <w:sz w:val="19"/>
                 <w:szCs w:val="19"/>
               </w:rPr>
+              <w:t xml:space="preserve">Step 1
+검수 UI</w:t>
+            </w:r>
+          </w:p>
+        </w:tc>
+        <w:tc>
+          <w:tcPr>
+            <w:tcW w:type="dxa" w:w="1600"/>
+            <w:tcBorders>
+              <w:top w:val="single" w:color="CCCCCC" w:sz="1"/>
+              <w:left w:val="single" w:color="CCCCCC" w:sz="1"/>
+              <w:bottom w:val="single" w:color="CCCCCC" w:sz="1"/>
+              <w:right w:val="single" w:color="CCCCCC" w:sz="1"/>
+            </w:tcBorders>
+            <w:shd w:fill="FFFFFF" w:val="clear"/>
+            <w:tcMar>
+              <w:top w:type="dxa" w:w="80"/>
+              <w:left w:type="dxa" w:w="120"/>
+              <w:bottom w:type="dxa" w:w="80"/>
+              <w:right w:type="dxa" w:w="120"/>
+            </w:tcMar>
+          </w:tcPr>
+          <w:p>
+            <w:r>
+              <w:rPr>
+                <w:rFonts w:ascii="Apple SD Gothic Neo" w:cs="Apple SD Gothic Neo" w:eastAsia="Apple SD Gothic Neo" w:hAnsi="Apple SD Gothic Neo"/>
+                <w:sz w:val="19"/>
+                <w:szCs w:val="19"/>
+              </w:rPr>
+              <w:t xml:space="preserve">사람</w:t>
+            </w:r>
+          </w:p>
+        </w:tc>
+        <w:tc>
+          <w:tcPr>
+            <w:tcW w:type="dxa" w:w="2000"/>
+            <w:tcBorders>
+              <w:top w:val="single" w:color="CCCCCC" w:sz="1"/>
+              <w:left w:val="single" w:color="CCCCCC" w:sz="1"/>
+              <w:bottom w:val="single" w:color="CCCCCC" w:sz="1"/>
+              <w:right w:val="single" w:color="CCCCCC" w:sz="1"/>
+            </w:tcBorders>
+            <w:shd w:fill="FFFFFF" w:val="clear"/>
+            <w:tcMar>
+              <w:top w:type="dxa" w:w="80"/>
+              <w:left w:type="dxa" w:w="120"/>
+              <w:bottom w:type="dxa" w:w="80"/>
+              <w:right w:type="dxa" w:w="120"/>
+            </w:tcMar>
+          </w:tcPr>
+          <w:p>
+            <w:r>
+              <w:rPr>
+                <w:rFonts w:ascii="Apple SD Gothic Neo" w:cs="Apple SD Gothic Neo" w:eastAsia="Apple SD Gothic Neo" w:hAnsi="Apple SD Gothic Neo"/>
+                <w:sz w:val="19"/>
+                <w:szCs w:val="19"/>
+              </w:rPr>
+              <w:t xml:space="preserve">시나리오 검수·수정</w:t>
+            </w:r>
+          </w:p>
+        </w:tc>
+        <w:tc>
+          <w:tcPr>
+            <w:tcW w:type="dxa" w:w="2400"/>
+            <w:tcBorders>
+              <w:top w:val="single" w:color="CCCCCC" w:sz="1"/>
+              <w:left w:val="single" w:color="CCCCCC" w:sz="1"/>
+              <w:bottom w:val="single" w:color="CCCCCC" w:sz="1"/>
+              <w:right w:val="single" w:color="CCCCCC" w:sz="1"/>
+            </w:tcBorders>
+            <w:shd w:fill="FFFFFF" w:val="clear"/>
+            <w:tcMar>
+              <w:top w:type="dxa" w:w="80"/>
+              <w:left w:type="dxa" w:w="120"/>
+              <w:bottom w:type="dxa" w:w="80"/>
+              <w:right w:type="dxa" w:w="120"/>
+            </w:tcMar>
+          </w:tcPr>
+          <w:p>
+            <w:r>
+              <w:rPr>
+                <w:rFonts w:ascii="Apple SD Gothic Neo" w:cs="Apple SD Gothic Neo" w:eastAsia="Apple SD Gothic Neo" w:hAnsi="Apple SD Gothic Neo"/>
+                <w:sz w:val="19"/>
+                <w:szCs w:val="19"/>
+              </w:rPr>
+              <w:t xml:space="preserve">output/step1/$RUN_ID/ (위 산출물)</w:t>
+            </w:r>
+          </w:p>
+        </w:tc>
+        <w:tc>
+          <w:tcPr>
+            <w:tcW w:type="dxa" w:w="2026"/>
+            <w:tcBorders>
+              <w:top w:val="single" w:color="CCCCCC" w:sz="1"/>
+              <w:left w:val="single" w:color="CCCCCC" w:sz="1"/>
+              <w:bottom w:val="single" w:color="CCCCCC" w:sz="1"/>
+              <w:right w:val="single" w:color="CCCCCC" w:sz="1"/>
+            </w:tcBorders>
+            <w:shd w:fill="FFFFFF" w:val="clear"/>
+            <w:tcMar>
+              <w:top w:type="dxa" w:w="80"/>
+              <w:left w:type="dxa" w:w="120"/>
+              <w:bottom w:type="dxa" w:w="80"/>
+              <w:right w:type="dxa" w:w="120"/>
+            </w:tcMar>
+          </w:tcPr>
+          <w:p>
+            <w:r>
+              <w:rPr>
+                <w:rFonts w:ascii="Apple SD Gothic Neo" w:cs="Apple SD Gothic Neo" w:eastAsia="Apple SD Gothic Neo" w:hAnsi="Apple SD Gothic Neo"/>
+                <w:sz w:val="19"/>
+                <w:szCs w:val="19"/>
+              </w:rPr>
+              <w:t xml:space="preserve">output/step1/$RUN_ID/ (수정 반영)
+output/latest_run (RUN_ID 기록)</w:t>
+            </w:r>
+          </w:p>
+        </w:tc>
+      </w:tr>
+      <w:tr>
+        <w:tc>
+          <w:tcPr>
+            <w:tcW w:type="dxa" w:w="1000"/>
+            <w:tcBorders>
+              <w:top w:val="single" w:color="CCCCCC" w:sz="1"/>
+              <w:left w:val="single" w:color="CCCCCC" w:sz="1"/>
+              <w:bottom w:val="single" w:color="CCCCCC" w:sz="1"/>
+              <w:right w:val="single" w:color="CCCCCC" w:sz="1"/>
+            </w:tcBorders>
+            <w:shd w:fill="F5F8FF" w:val="clear"/>
+            <w:tcMar>
+              <w:top w:type="dxa" w:w="80"/>
+              <w:left w:type="dxa" w:w="120"/>
+              <w:bottom w:type="dxa" w:w="80"/>
+              <w:right w:type="dxa" w:w="120"/>
+            </w:tcMar>
+          </w:tcPr>
+          <w:p>
+            <w:r>
+              <w:rPr>
+                <w:rFonts w:ascii="Apple SD Gothic Neo" w:cs="Apple SD Gothic Neo" w:eastAsia="Apple SD Gothic Neo" w:hAnsi="Apple SD Gothic Neo"/>
+                <w:sz w:val="19"/>
+                <w:szCs w:val="19"/>
+              </w:rPr>
               <w:t xml:space="preserve">Step 2</w:t>
             </w:r>
           </w:p>
         </w:tc>
         <w:tc>
           <w:tcPr>
-            <w:tcW w:type="dxa" w:w="1800"/>
-            <w:tcBorders>
-              <w:top w:val="single" w:color="CCCCCC" w:sz="1"/>
-              <w:left w:val="single" w:color="CCCCCC" w:sz="1"/>
-              <w:bottom w:val="single" w:color="CCCCCC" w:sz="1"/>
-              <w:right w:val="single" w:color="CCCCCC" w:sz="1"/>
-            </w:tcBorders>
-            <w:shd w:fill="FFFFFF" w:val="clear"/>
+            <w:tcW w:type="dxa" w:w="1600"/>
+            <w:tcBorders>
+              <w:top w:val="single" w:color="CCCCCC" w:sz="1"/>
+              <w:left w:val="single" w:color="CCCCCC" w:sz="1"/>
+              <w:bottom w:val="single" w:color="CCCCCC" w:sz="1"/>
+              <w:right w:val="single" w:color="CCCCCC" w:sz="1"/>
+            </w:tcBorders>
+            <w:shd w:fill="F5F8FF" w:val="clear"/>
             <w:tcMar>
               <w:top w:type="dxa" w:w="80"/>
               <w:left w:type="dxa" w:w="120"/>
@@ -981,14 +1246,14 @@
         </w:tc>
         <w:tc>
           <w:tcPr>
-            <w:tcW w:type="dxa" w:w="2400"/>
-            <w:tcBorders>
-              <w:top w:val="single" w:color="CCCCCC" w:sz="1"/>
-              <w:left w:val="single" w:color="CCCCCC" w:sz="1"/>
-              <w:bottom w:val="single" w:color="CCCCCC" w:sz="1"/>
-              <w:right w:val="single" w:color="CCCCCC" w:sz="1"/>
-            </w:tcBorders>
-            <w:shd w:fill="FFFFFF" w:val="clear"/>
+            <w:tcW w:type="dxa" w:w="2000"/>
+            <w:tcBorders>
+              <w:top w:val="single" w:color="CCCCCC" w:sz="1"/>
+              <w:left w:val="single" w:color="CCCCCC" w:sz="1"/>
+              <w:bottom w:val="single" w:color="CCCCCC" w:sz="1"/>
+              <w:right w:val="single" w:color="CCCCCC" w:sz="1"/>
+            </w:tcBorders>
+            <w:shd w:fill="F5F8FF" w:val="clear"/>
             <w:tcMar>
               <w:top w:type="dxa" w:w="80"/>
               <w:left w:type="dxa" w:w="120"/>
@@ -1010,60 +1275,60 @@
         </w:tc>
         <w:tc>
           <w:tcPr>
-            <w:tcW w:type="dxa" w:w="2200"/>
-            <w:tcBorders>
-              <w:top w:val="single" w:color="CCCCCC" w:sz="1"/>
-              <w:left w:val="single" w:color="CCCCCC" w:sz="1"/>
-              <w:bottom w:val="single" w:color="CCCCCC" w:sz="1"/>
-              <w:right w:val="single" w:color="CCCCCC" w:sz="1"/>
-            </w:tcBorders>
-            <w:shd w:fill="FFFFFF" w:val="clear"/>
-            <w:tcMar>
-              <w:top w:type="dxa" w:w="80"/>
-              <w:left w:type="dxa" w:w="120"/>
-              <w:bottom w:type="dxa" w:w="80"/>
-              <w:right w:type="dxa" w:w="120"/>
-            </w:tcMar>
-          </w:tcPr>
-          <w:p>
-            <w:r>
-              <w:rPr>
-                <w:rFonts w:ascii="Apple SD Gothic Neo" w:cs="Apple SD Gothic Neo" w:eastAsia="Apple SD Gothic Neo" w:hAnsi="Apple SD Gothic Neo"/>
-                <w:sz w:val="19"/>
-                <w:szCs w:val="19"/>
-              </w:rPr>
-              <w:t xml:space="preserve">qa_scenarios.csv
-qa_definition.md</w:t>
-            </w:r>
-          </w:p>
-        </w:tc>
-        <w:tc>
-          <w:tcPr>
-            <w:tcW w:type="dxa" w:w="1626"/>
-            <w:tcBorders>
-              <w:top w:val="single" w:color="CCCCCC" w:sz="1"/>
-              <w:left w:val="single" w:color="CCCCCC" w:sz="1"/>
-              <w:bottom w:val="single" w:color="CCCCCC" w:sz="1"/>
-              <w:right w:val="single" w:color="CCCCCC" w:sz="1"/>
-            </w:tcBorders>
-            <w:shd w:fill="FFFFFF" w:val="clear"/>
-            <w:tcMar>
-              <w:top w:type="dxa" w:w="80"/>
-              <w:left w:type="dxa" w:w="120"/>
-              <w:bottom w:type="dxa" w:w="80"/>
-              <w:right w:type="dxa" w:w="120"/>
-            </w:tcMar>
-          </w:tcPr>
-          <w:p>
-            <w:r>
-              <w:rPr>
-                <w:rFonts w:ascii="Apple SD Gothic Neo" w:cs="Apple SD Gothic Neo" w:eastAsia="Apple SD Gothic Neo" w:hAnsi="Apple SD Gothic Neo"/>
-                <w:sz w:val="19"/>
-                <w:szCs w:val="19"/>
-              </w:rPr>
-              <w:t xml:space="preserve">qa_results.csv
-screenshots/ (실패)
-캡처 대상 URL 목록</w:t>
+            <w:tcW w:type="dxa" w:w="2400"/>
+            <w:tcBorders>
+              <w:top w:val="single" w:color="CCCCCC" w:sz="1"/>
+              <w:left w:val="single" w:color="CCCCCC" w:sz="1"/>
+              <w:bottom w:val="single" w:color="CCCCCC" w:sz="1"/>
+              <w:right w:val="single" w:color="CCCCCC" w:sz="1"/>
+            </w:tcBorders>
+            <w:shd w:fill="F5F8FF" w:val="clear"/>
+            <w:tcMar>
+              <w:top w:type="dxa" w:w="80"/>
+              <w:left w:type="dxa" w:w="120"/>
+              <w:bottom w:type="dxa" w:w="80"/>
+              <w:right w:type="dxa" w:w="120"/>
+            </w:tcMar>
+          </w:tcPr>
+          <w:p>
+            <w:r>
+              <w:rPr>
+                <w:rFonts w:ascii="Apple SD Gothic Neo" w:cs="Apple SD Gothic Neo" w:eastAsia="Apple SD Gothic Neo" w:hAnsi="Apple SD Gothic Neo"/>
+                <w:sz w:val="19"/>
+                <w:szCs w:val="19"/>
+              </w:rPr>
+              <w:t xml:space="preserve">output/step1/$RUN_ID/
+(latest_run으로 RUN_ID 확인)</w:t>
+            </w:r>
+          </w:p>
+        </w:tc>
+        <w:tc>
+          <w:tcPr>
+            <w:tcW w:type="dxa" w:w="2026"/>
+            <w:tcBorders>
+              <w:top w:val="single" w:color="CCCCCC" w:sz="1"/>
+              <w:left w:val="single" w:color="CCCCCC" w:sz="1"/>
+              <w:bottom w:val="single" w:color="CCCCCC" w:sz="1"/>
+              <w:right w:val="single" w:color="CCCCCC" w:sz="1"/>
+            </w:tcBorders>
+            <w:shd w:fill="F5F8FF" w:val="clear"/>
+            <w:tcMar>
+              <w:top w:type="dxa" w:w="80"/>
+              <w:left w:type="dxa" w:w="120"/>
+              <w:bottom w:type="dxa" w:w="80"/>
+              <w:right w:type="dxa" w:w="120"/>
+            </w:tcMar>
+          </w:tcPr>
+          <w:p>
+            <w:r>
+              <w:rPr>
+                <w:rFonts w:ascii="Apple SD Gothic Neo" w:cs="Apple SD Gothic Neo" w:eastAsia="Apple SD Gothic Neo" w:hAnsi="Apple SD Gothic Neo"/>
+                <w:sz w:val="19"/>
+                <w:szCs w:val="19"/>
+              </w:rPr>
+              <w:t xml:space="preserve">output/step2/$RUN_ID/
+  qa_results.csv
+  screenshots/ (실패)</w:t>
             </w:r>
           </w:p>
         </w:tc>
@@ -1078,7 +1343,7 @@
               <w:bottom w:val="single" w:color="CCCCCC" w:sz="1"/>
               <w:right w:val="single" w:color="CCCCCC" w:sz="1"/>
             </w:tcBorders>
-            <w:shd w:fill="F5F8FF" w:val="clear"/>
+            <w:shd w:fill="FFFFFF" w:val="clear"/>
             <w:tcMar>
               <w:top w:type="dxa" w:w="80"/>
               <w:left w:type="dxa" w:w="120"/>
@@ -1099,14 +1364,14 @@
         </w:tc>
         <w:tc>
           <w:tcPr>
-            <w:tcW w:type="dxa" w:w="1800"/>
-            <w:tcBorders>
-              <w:top w:val="single" w:color="CCCCCC" w:sz="1"/>
-              <w:left w:val="single" w:color="CCCCCC" w:sz="1"/>
-              <w:bottom w:val="single" w:color="CCCCCC" w:sz="1"/>
-              <w:right w:val="single" w:color="CCCCCC" w:sz="1"/>
-            </w:tcBorders>
-            <w:shd w:fill="F5F8FF" w:val="clear"/>
+            <w:tcW w:type="dxa" w:w="1600"/>
+            <w:tcBorders>
+              <w:top w:val="single" w:color="CCCCCC" w:sz="1"/>
+              <w:left w:val="single" w:color="CCCCCC" w:sz="1"/>
+              <w:bottom w:val="single" w:color="CCCCCC" w:sz="1"/>
+              <w:right w:val="single" w:color="CCCCCC" w:sz="1"/>
+            </w:tcBorders>
+            <w:shd w:fill="FFFFFF" w:val="clear"/>
             <w:tcMar>
               <w:top w:type="dxa" w:w="80"/>
               <w:left w:type="dxa" w:w="120"/>
@@ -1128,6 +1393,34 @@
         </w:tc>
         <w:tc>
           <w:tcPr>
+            <w:tcW w:type="dxa" w:w="2000"/>
+            <w:tcBorders>
+              <w:top w:val="single" w:color="CCCCCC" w:sz="1"/>
+              <w:left w:val="single" w:color="CCCCCC" w:sz="1"/>
+              <w:bottom w:val="single" w:color="CCCCCC" w:sz="1"/>
+              <w:right w:val="single" w:color="CCCCCC" w:sz="1"/>
+            </w:tcBorders>
+            <w:shd w:fill="FFFFFF" w:val="clear"/>
+            <w:tcMar>
+              <w:top w:type="dxa" w:w="80"/>
+              <w:left w:type="dxa" w:w="120"/>
+              <w:bottom w:type="dxa" w:w="80"/>
+              <w:right w:type="dxa" w:w="120"/>
+            </w:tcMar>
+          </w:tcPr>
+          <w:p>
+            <w:r>
+              <w:rPr>
+                <w:rFonts w:ascii="Apple SD Gothic Neo" w:cs="Apple SD Gothic Neo" w:eastAsia="Apple SD Gothic Neo" w:hAnsi="Apple SD Gothic Neo"/>
+                <w:sz w:val="19"/>
+                <w:szCs w:val="19"/>
+              </w:rPr>
+              <w:t xml:space="preserve">화면 캡처</w:t>
+            </w:r>
+          </w:p>
+        </w:tc>
+        <w:tc>
+          <w:tcPr>
             <w:tcW w:type="dxa" w:w="2400"/>
             <w:tcBorders>
               <w:top w:val="single" w:color="CCCCCC" w:sz="1"/>
@@ -1135,80 +1428,54 @@
               <w:bottom w:val="single" w:color="CCCCCC" w:sz="1"/>
               <w:right w:val="single" w:color="CCCCCC" w:sz="1"/>
             </w:tcBorders>
-            <w:shd w:fill="F5F8FF" w:val="clear"/>
-            <w:tcMar>
-              <w:top w:type="dxa" w:w="80"/>
-              <w:left w:type="dxa" w:w="120"/>
-              <w:bottom w:type="dxa" w:w="80"/>
-              <w:right w:type="dxa" w:w="120"/>
-            </w:tcMar>
-          </w:tcPr>
-          <w:p>
-            <w:r>
-              <w:rPr>
-                <w:rFonts w:ascii="Apple SD Gothic Neo" w:cs="Apple SD Gothic Neo" w:eastAsia="Apple SD Gothic Neo" w:hAnsi="Apple SD Gothic Neo"/>
-                <w:sz w:val="19"/>
-                <w:szCs w:val="19"/>
-              </w:rPr>
-              <w:t xml:space="preserve">화면 캡처</w:t>
-            </w:r>
-          </w:p>
-        </w:tc>
-        <w:tc>
-          <w:tcPr>
-            <w:tcW w:type="dxa" w:w="2200"/>
-            <w:tcBorders>
-              <w:top w:val="single" w:color="CCCCCC" w:sz="1"/>
-              <w:left w:val="single" w:color="CCCCCC" w:sz="1"/>
-              <w:bottom w:val="single" w:color="CCCCCC" w:sz="1"/>
-              <w:right w:val="single" w:color="CCCCCC" w:sz="1"/>
-            </w:tcBorders>
-            <w:shd w:fill="F5F8FF" w:val="clear"/>
-            <w:tcMar>
-              <w:top w:type="dxa" w:w="80"/>
-              <w:left w:type="dxa" w:w="120"/>
-              <w:bottom w:type="dxa" w:w="80"/>
-              <w:right w:type="dxa" w:w="120"/>
-            </w:tcMar>
-          </w:tcPr>
-          <w:p>
-            <w:r>
-              <w:rPr>
-                <w:rFonts w:ascii="Apple SD Gothic Neo" w:cs="Apple SD Gothic Neo" w:eastAsia="Apple SD Gothic Neo" w:hAnsi="Apple SD Gothic Neo"/>
-                <w:sz w:val="19"/>
-                <w:szCs w:val="19"/>
-              </w:rPr>
-              <w:t xml:space="preserve">Step 2 도출 실제 URL
-capture.py 스크립트</w:t>
-            </w:r>
-          </w:p>
-        </w:tc>
-        <w:tc>
-          <w:tcPr>
-            <w:tcW w:type="dxa" w:w="1626"/>
-            <w:tcBorders>
-              <w:top w:val="single" w:color="CCCCCC" w:sz="1"/>
-              <w:left w:val="single" w:color="CCCCCC" w:sz="1"/>
-              <w:bottom w:val="single" w:color="CCCCCC" w:sz="1"/>
-              <w:right w:val="single" w:color="CCCCCC" w:sz="1"/>
-            </w:tcBorders>
-            <w:shd w:fill="F5F8FF" w:val="clear"/>
-            <w:tcMar>
-              <w:top w:type="dxa" w:w="80"/>
-              <w:left w:type="dxa" w:w="120"/>
-              <w:bottom w:type="dxa" w:w="80"/>
-              <w:right w:type="dxa" w:w="120"/>
-            </w:tcMar>
-          </w:tcPr>
-          <w:p>
-            <w:r>
-              <w:rPr>
-                <w:rFonts w:ascii="Apple SD Gothic Neo" w:cs="Apple SD Gothic Neo" w:eastAsia="Apple SD Gothic Neo" w:hAnsi="Apple SD Gothic Neo"/>
-                <w:sz w:val="19"/>
-                <w:szCs w:val="19"/>
-              </w:rPr>
-              <w:t xml:space="preserve">screenshots/ (전체)
-capture_errors.log</w:t>
+            <w:shd w:fill="FFFFFF" w:val="clear"/>
+            <w:tcMar>
+              <w:top w:type="dxa" w:w="80"/>
+              <w:left w:type="dxa" w:w="120"/>
+              <w:bottom w:type="dxa" w:w="80"/>
+              <w:right w:type="dxa" w:w="120"/>
+            </w:tcMar>
+          </w:tcPr>
+          <w:p>
+            <w:r>
+              <w:rPr>
+                <w:rFonts w:ascii="Apple SD Gothic Neo" w:cs="Apple SD Gothic Neo" w:eastAsia="Apple SD Gothic Neo" w:hAnsi="Apple SD Gothic Neo"/>
+                <w:sz w:val="19"/>
+                <w:szCs w:val="19"/>
+              </w:rPr>
+              <w:t xml:space="preserve">output/step2/$RUN_ID/
+pipeline_config.md (URL 목록)</w:t>
+            </w:r>
+          </w:p>
+        </w:tc>
+        <w:tc>
+          <w:tcPr>
+            <w:tcW w:type="dxa" w:w="2026"/>
+            <w:tcBorders>
+              <w:top w:val="single" w:color="CCCCCC" w:sz="1"/>
+              <w:left w:val="single" w:color="CCCCCC" w:sz="1"/>
+              <w:bottom w:val="single" w:color="CCCCCC" w:sz="1"/>
+              <w:right w:val="single" w:color="CCCCCC" w:sz="1"/>
+            </w:tcBorders>
+            <w:shd w:fill="FFFFFF" w:val="clear"/>
+            <w:tcMar>
+              <w:top w:type="dxa" w:w="80"/>
+              <w:left w:type="dxa" w:w="120"/>
+              <w:bottom w:type="dxa" w:w="80"/>
+              <w:right w:type="dxa" w:w="120"/>
+            </w:tcMar>
+          </w:tcPr>
+          <w:p>
+            <w:r>
+              <w:rPr>
+                <w:rFonts w:ascii="Apple SD Gothic Neo" w:cs="Apple SD Gothic Neo" w:eastAsia="Apple SD Gothic Neo" w:hAnsi="Apple SD Gothic Neo"/>
+                <w:sz w:val="19"/>
+                <w:szCs w:val="19"/>
+              </w:rPr>
+              <w:t xml:space="preserve">output/step3/$RUN_ID/
+  screenshots/ (전체)
+  capture_errors.log
+scripts/capture.py</w:t>
             </w:r>
           </w:p>
         </w:tc>
@@ -1223,7 +1490,7 @@
               <w:bottom w:val="single" w:color="CCCCCC" w:sz="1"/>
               <w:right w:val="single" w:color="CCCCCC" w:sz="1"/>
             </w:tcBorders>
-            <w:shd w:fill="FFFFFF" w:val="clear"/>
+            <w:shd w:fill="F5F8FF" w:val="clear"/>
             <w:tcMar>
               <w:top w:type="dxa" w:w="80"/>
               <w:left w:type="dxa" w:w="120"/>
@@ -1244,14 +1511,14 @@
         </w:tc>
         <w:tc>
           <w:tcPr>
-            <w:tcW w:type="dxa" w:w="1800"/>
-            <w:tcBorders>
-              <w:top w:val="single" w:color="CCCCCC" w:sz="1"/>
-              <w:left w:val="single" w:color="CCCCCC" w:sz="1"/>
-              <w:bottom w:val="single" w:color="CCCCCC" w:sz="1"/>
-              <w:right w:val="single" w:color="CCCCCC" w:sz="1"/>
-            </w:tcBorders>
-            <w:shd w:fill="FFFFFF" w:val="clear"/>
+            <w:tcW w:type="dxa" w:w="1600"/>
+            <w:tcBorders>
+              <w:top w:val="single" w:color="CCCCCC" w:sz="1"/>
+              <w:left w:val="single" w:color="CCCCCC" w:sz="1"/>
+              <w:bottom w:val="single" w:color="CCCCCC" w:sz="1"/>
+              <w:right w:val="single" w:color="CCCCCC" w:sz="1"/>
+            </w:tcBorders>
+            <w:shd w:fill="F5F8FF" w:val="clear"/>
             <w:tcMar>
               <w:top w:type="dxa" w:w="80"/>
               <w:left w:type="dxa" w:w="120"/>
@@ -1272,6 +1539,34 @@
         </w:tc>
         <w:tc>
           <w:tcPr>
+            <w:tcW w:type="dxa" w:w="2000"/>
+            <w:tcBorders>
+              <w:top w:val="single" w:color="CCCCCC" w:sz="1"/>
+              <w:left w:val="single" w:color="CCCCCC" w:sz="1"/>
+              <w:bottom w:val="single" w:color="CCCCCC" w:sz="1"/>
+              <w:right w:val="single" w:color="CCCCCC" w:sz="1"/>
+            </w:tcBorders>
+            <w:shd w:fill="F5F8FF" w:val="clear"/>
+            <w:tcMar>
+              <w:top w:type="dxa" w:w="80"/>
+              <w:left w:type="dxa" w:w="120"/>
+              <w:bottom w:type="dxa" w:w="80"/>
+              <w:right w:type="dxa" w:w="120"/>
+            </w:tcMar>
+          </w:tcPr>
+          <w:p>
+            <w:r>
+              <w:rPr>
+                <w:rFonts w:ascii="Apple SD Gothic Neo" w:cs="Apple SD Gothic Neo" w:eastAsia="Apple SD Gothic Neo" w:hAnsi="Apple SD Gothic Neo"/>
+                <w:sz w:val="19"/>
+                <w:szCs w:val="19"/>
+              </w:rPr>
+              <w:t xml:space="preserve">최종 리포트 생성</w:t>
+            </w:r>
+          </w:p>
+        </w:tc>
+        <w:tc>
+          <w:tcPr>
             <w:tcW w:type="dxa" w:w="2400"/>
             <w:tcBorders>
               <w:top w:val="single" w:color="CCCCCC" w:sz="1"/>
@@ -1279,79 +1574,53 @@
               <w:bottom w:val="single" w:color="CCCCCC" w:sz="1"/>
               <w:right w:val="single" w:color="CCCCCC" w:sz="1"/>
             </w:tcBorders>
-            <w:shd w:fill="FFFFFF" w:val="clear"/>
-            <w:tcMar>
-              <w:top w:type="dxa" w:w="80"/>
-              <w:left w:type="dxa" w:w="120"/>
-              <w:bottom w:type="dxa" w:w="80"/>
-              <w:right w:type="dxa" w:w="120"/>
-            </w:tcMar>
-          </w:tcPr>
-          <w:p>
-            <w:r>
-              <w:rPr>
-                <w:rFonts w:ascii="Apple SD Gothic Neo" w:cs="Apple SD Gothic Neo" w:eastAsia="Apple SD Gothic Neo" w:hAnsi="Apple SD Gothic Neo"/>
-                <w:sz w:val="19"/>
-                <w:szCs w:val="19"/>
-              </w:rPr>
-              <w:t xml:space="preserve">최종 리포트 생성</w:t>
-            </w:r>
-          </w:p>
-        </w:tc>
-        <w:tc>
-          <w:tcPr>
-            <w:tcW w:type="dxa" w:w="2200"/>
-            <w:tcBorders>
-              <w:top w:val="single" w:color="CCCCCC" w:sz="1"/>
-              <w:left w:val="single" w:color="CCCCCC" w:sz="1"/>
-              <w:bottom w:val="single" w:color="CCCCCC" w:sz="1"/>
-              <w:right w:val="single" w:color="CCCCCC" w:sz="1"/>
-            </w:tcBorders>
-            <w:shd w:fill="FFFFFF" w:val="clear"/>
-            <w:tcMar>
-              <w:top w:type="dxa" w:w="80"/>
-              <w:left w:type="dxa" w:w="120"/>
-              <w:bottom w:type="dxa" w:w="80"/>
-              <w:right w:type="dxa" w:w="120"/>
-            </w:tcMar>
-          </w:tcPr>
-          <w:p>
-            <w:r>
-              <w:rPr>
-                <w:rFonts w:ascii="Apple SD Gothic Neo" w:cs="Apple SD Gothic Neo" w:eastAsia="Apple SD Gothic Neo" w:hAnsi="Apple SD Gothic Neo"/>
-                <w:sz w:val="19"/>
-                <w:szCs w:val="19"/>
-              </w:rPr>
-              <w:t xml:space="preserve">Step 1~3 전체 산출물</w:t>
-            </w:r>
-          </w:p>
-        </w:tc>
-        <w:tc>
-          <w:tcPr>
-            <w:tcW w:type="dxa" w:w="1626"/>
-            <w:tcBorders>
-              <w:top w:val="single" w:color="CCCCCC" w:sz="1"/>
-              <w:left w:val="single" w:color="CCCCCC" w:sz="1"/>
-              <w:bottom w:val="single" w:color="CCCCCC" w:sz="1"/>
-              <w:right w:val="single" w:color="CCCCCC" w:sz="1"/>
-            </w:tcBorders>
-            <w:shd w:fill="FFFFFF" w:val="clear"/>
-            <w:tcMar>
-              <w:top w:type="dxa" w:w="80"/>
-              <w:left w:type="dxa" w:w="120"/>
-              <w:bottom w:type="dxa" w:w="80"/>
-              <w:right w:type="dxa" w:w="120"/>
-            </w:tcMar>
-          </w:tcPr>
-          <w:p>
-            <w:r>
-              <w:rPr>
-                <w:rFonts w:ascii="Apple SD Gothic Neo" w:cs="Apple SD Gothic Neo" w:eastAsia="Apple SD Gothic Neo" w:hAnsi="Apple SD Gothic Neo"/>
-                <w:sz w:val="19"/>
-                <w:szCs w:val="19"/>
-              </w:rPr>
-              <w:t xml:space="preserve">qa_final_report.csv
-qa_summary.md</w:t>
+            <w:shd w:fill="F5F8FF" w:val="clear"/>
+            <w:tcMar>
+              <w:top w:type="dxa" w:w="80"/>
+              <w:left w:type="dxa" w:w="120"/>
+              <w:bottom w:type="dxa" w:w="80"/>
+              <w:right w:type="dxa" w:w="120"/>
+            </w:tcMar>
+          </w:tcPr>
+          <w:p>
+            <w:r>
+              <w:rPr>
+                <w:rFonts w:ascii="Apple SD Gothic Neo" w:cs="Apple SD Gothic Neo" w:eastAsia="Apple SD Gothic Neo" w:hAnsi="Apple SD Gothic Neo"/>
+                <w:sz w:val="19"/>
+                <w:szCs w:val="19"/>
+              </w:rPr>
+              <w:t xml:space="preserve">output/step1~3/$RUN_ID/ 전체
+input/figma_frames/$RUN_ID/</w:t>
+            </w:r>
+          </w:p>
+        </w:tc>
+        <w:tc>
+          <w:tcPr>
+            <w:tcW w:type="dxa" w:w="2026"/>
+            <w:tcBorders>
+              <w:top w:val="single" w:color="CCCCCC" w:sz="1"/>
+              <w:left w:val="single" w:color="CCCCCC" w:sz="1"/>
+              <w:bottom w:val="single" w:color="CCCCCC" w:sz="1"/>
+              <w:right w:val="single" w:color="CCCCCC" w:sz="1"/>
+            </w:tcBorders>
+            <w:shd w:fill="F5F8FF" w:val="clear"/>
+            <w:tcMar>
+              <w:top w:type="dxa" w:w="80"/>
+              <w:left w:type="dxa" w:w="120"/>
+              <w:bottom w:type="dxa" w:w="80"/>
+              <w:right w:type="dxa" w:w="120"/>
+            </w:tcMar>
+          </w:tcPr>
+          <w:p>
+            <w:r>
+              <w:rPr>
+                <w:rFonts w:ascii="Apple SD Gothic Neo" w:cs="Apple SD Gothic Neo" w:eastAsia="Apple SD Gothic Neo" w:hAnsi="Apple SD Gothic Neo"/>
+                <w:sz w:val="19"/>
+                <w:szCs w:val="19"/>
+              </w:rPr>
+              <w:t xml:space="preserve">output/step4/$RUN_ID/
+  qa_final_report.csv
+  qa_summary.md</w:t>
             </w:r>
           </w:p>
         </w:tc>
@@ -1853,8 +2122,8 @@
       </w:tblPr>
       <w:tblGrid>
         <w:gridCol w:w="3200"/>
-        <w:gridCol w:w="1800"/>
-        <w:gridCol w:w="4026"/>
+        <w:gridCol w:w="1600"/>
+        <w:gridCol w:w="4226"/>
       </w:tblGrid>
       <w:tr>
         <w:trPr>
@@ -1893,7 +2162,7 @@
         </w:tc>
         <w:tc>
           <w:tcPr>
-            <w:tcW w:type="dxa" w:w="1800"/>
+            <w:tcW w:type="dxa" w:w="1600"/>
             <w:tcBorders>
               <w:top w:val="single" w:color="4472C4" w:sz="1"/>
               <w:left w:val="single" w:color="4472C4" w:sz="1"/>
@@ -1924,7 +2193,7 @@
         </w:tc>
         <w:tc>
           <w:tcPr>
-            <w:tcW w:type="dxa" w:w="4026"/>
+            <w:tcW w:type="dxa" w:w="4226"/>
             <w:tcBorders>
               <w:top w:val="single" w:color="4472C4" w:sz="1"/>
               <w:left w:val="single" w:color="4472C4" w:sz="1"/>
@@ -1985,7 +2254,7 @@
         </w:tc>
         <w:tc>
           <w:tcPr>
-            <w:tcW w:type="dxa" w:w="1800"/>
+            <w:tcW w:type="dxa" w:w="1600"/>
             <w:tcBorders>
               <w:top w:val="single" w:color="CCCCCC" w:sz="1"/>
               <w:left w:val="single" w:color="CCCCCC" w:sz="1"/>
@@ -2013,7 +2282,7 @@
         </w:tc>
         <w:tc>
           <w:tcPr>
-            <w:tcW w:type="dxa" w:w="4026"/>
+            <w:tcW w:type="dxa" w:w="4226"/>
             <w:tcBorders>
               <w:top w:val="single" w:color="CCCCCC" w:sz="1"/>
               <w:left w:val="single" w:color="CCCCCC" w:sz="1"/>
@@ -2072,7 +2341,7 @@
         </w:tc>
         <w:tc>
           <w:tcPr>
-            <w:tcW w:type="dxa" w:w="1800"/>
+            <w:tcW w:type="dxa" w:w="1600"/>
             <w:tcBorders>
               <w:top w:val="single" w:color="CCCCCC" w:sz="1"/>
               <w:left w:val="single" w:color="CCCCCC" w:sz="1"/>
@@ -2100,7 +2369,7 @@
         </w:tc>
         <w:tc>
           <w:tcPr>
-            <w:tcW w:type="dxa" w:w="4026"/>
+            <w:tcW w:type="dxa" w:w="4226"/>
             <w:tcBorders>
               <w:top w:val="single" w:color="CCCCCC" w:sz="1"/>
               <w:left w:val="single" w:color="CCCCCC" w:sz="1"/>
@@ -2158,7 +2427,7 @@
         </w:tc>
         <w:tc>
           <w:tcPr>
-            <w:tcW w:type="dxa" w:w="1800"/>
+            <w:tcW w:type="dxa" w:w="1600"/>
             <w:tcBorders>
               <w:top w:val="single" w:color="CCCCCC" w:sz="1"/>
               <w:left w:val="single" w:color="CCCCCC" w:sz="1"/>
@@ -2186,7 +2455,7 @@
         </w:tc>
         <w:tc>
           <w:tcPr>
-            <w:tcW w:type="dxa" w:w="4026"/>
+            <w:tcW w:type="dxa" w:w="4226"/>
             <w:tcBorders>
               <w:top w:val="single" w:color="CCCCCC" w:sz="1"/>
               <w:left w:val="single" w:color="CCCCCC" w:sz="1"/>
@@ -2209,7 +2478,7 @@
                 <w:szCs w:val="19"/>
               </w:rPr>
               <w:t xml:space="preserve">Step 1 시나리오 생성 — 검수포함
-(사람 검수 단계 포함)</w:t>
+사람 검수 UI + 저장&amp;커밋으로 latest_run 생성</w:t>
             </w:r>
           </w:p>
         </w:tc>
@@ -2245,7 +2514,7 @@
         </w:tc>
         <w:tc>
           <w:tcPr>
-            <w:tcW w:type="dxa" w:w="1800"/>
+            <w:tcW w:type="dxa" w:w="1600"/>
             <w:tcBorders>
               <w:top w:val="single" w:color="CCCCCC" w:sz="1"/>
               <w:left w:val="single" w:color="CCCCCC" w:sz="1"/>
@@ -2273,7 +2542,7 @@
         </w:tc>
         <w:tc>
           <w:tcPr>
-            <w:tcW w:type="dxa" w:w="4026"/>
+            <w:tcW w:type="dxa" w:w="4226"/>
             <w:tcBorders>
               <w:top w:val="single" w:color="CCCCCC" w:sz="1"/>
               <w:left w:val="single" w:color="CCCCCC" w:sz="1"/>
@@ -2331,7 +2600,7 @@
         </w:tc>
         <w:tc>
           <w:tcPr>
-            <w:tcW w:type="dxa" w:w="1800"/>
+            <w:tcW w:type="dxa" w:w="1600"/>
             <w:tcBorders>
               <w:top w:val="single" w:color="CCCCCC" w:sz="1"/>
               <w:left w:val="single" w:color="CCCCCC" w:sz="1"/>
@@ -2359,29 +2628,30 @@
         </w:tc>
         <w:tc>
           <w:tcPr>
-            <w:tcW w:type="dxa" w:w="4026"/>
-            <w:tcBorders>
-              <w:top w:val="single" w:color="CCCCCC" w:sz="1"/>
-              <w:left w:val="single" w:color="CCCCCC" w:sz="1"/>
-              <w:bottom w:val="single" w:color="CCCCCC" w:sz="1"/>
-              <w:right w:val="single" w:color="CCCCCC" w:sz="1"/>
-            </w:tcBorders>
-            <w:shd w:fill="F5F8FF" w:val="clear"/>
-            <w:tcMar>
-              <w:top w:type="dxa" w:w="80"/>
-              <w:left w:type="dxa" w:w="120"/>
-              <w:bottom w:type="dxa" w:w="80"/>
-              <w:right w:type="dxa" w:w="120"/>
-            </w:tcMar>
-          </w:tcPr>
-          <w:p>
-            <w:r>
-              <w:rPr>
-                <w:rFonts w:ascii="Apple SD Gothic Neo" w:cs="Apple SD Gothic Neo" w:eastAsia="Apple SD Gothic Neo" w:hAnsi="Apple SD Gothic Neo"/>
-                <w:sz w:val="19"/>
-                <w:szCs w:val="19"/>
-              </w:rPr>
-              <w:t xml:space="preserve">Step 2 QA 실행 — 검수포함</w:t>
+            <w:tcW w:type="dxa" w:w="4226"/>
+            <w:tcBorders>
+              <w:top w:val="single" w:color="CCCCCC" w:sz="1"/>
+              <w:left w:val="single" w:color="CCCCCC" w:sz="1"/>
+              <w:bottom w:val="single" w:color="CCCCCC" w:sz="1"/>
+              <w:right w:val="single" w:color="CCCCCC" w:sz="1"/>
+            </w:tcBorders>
+            <w:shd w:fill="F5F8FF" w:val="clear"/>
+            <w:tcMar>
+              <w:top w:type="dxa" w:w="80"/>
+              <w:left w:type="dxa" w:w="120"/>
+              <w:bottom w:type="dxa" w:w="80"/>
+              <w:right w:type="dxa" w:w="120"/>
+            </w:tcMar>
+          </w:tcPr>
+          <w:p>
+            <w:r>
+              <w:rPr>
+                <w:rFonts w:ascii="Apple SD Gothic Neo" w:cs="Apple SD Gothic Neo" w:eastAsia="Apple SD Gothic Neo" w:hAnsi="Apple SD Gothic Neo"/>
+                <w:sz w:val="19"/>
+                <w:szCs w:val="19"/>
+              </w:rPr>
+              <w:t xml:space="preserve">Step 2 QA 실행 — 검수포함
+output/latest_run으로 RUN_ID 확인</w:t>
             </w:r>
           </w:p>
         </w:tc>
@@ -2417,7 +2687,7 @@
         </w:tc>
         <w:tc>
           <w:tcPr>
-            <w:tcW w:type="dxa" w:w="1800"/>
+            <w:tcW w:type="dxa" w:w="1600"/>
             <w:tcBorders>
               <w:top w:val="single" w:color="CCCCCC" w:sz="1"/>
               <w:left w:val="single" w:color="CCCCCC" w:sz="1"/>
@@ -2445,7 +2715,7 @@
         </w:tc>
         <w:tc>
           <w:tcPr>
-            <w:tcW w:type="dxa" w:w="4026"/>
+            <w:tcW w:type="dxa" w:w="4226"/>
             <w:tcBorders>
               <w:top w:val="single" w:color="CCCCCC" w:sz="1"/>
               <w:left w:val="single" w:color="CCCCCC" w:sz="1"/>
@@ -2503,7 +2773,7 @@
         </w:tc>
         <w:tc>
           <w:tcPr>
-            <w:tcW w:type="dxa" w:w="1800"/>
+            <w:tcW w:type="dxa" w:w="1600"/>
             <w:tcBorders>
               <w:top w:val="single" w:color="CCCCCC" w:sz="1"/>
               <w:left w:val="single" w:color="CCCCCC" w:sz="1"/>
@@ -2531,29 +2801,30 @@
         </w:tc>
         <w:tc>
           <w:tcPr>
-            <w:tcW w:type="dxa" w:w="4026"/>
-            <w:tcBorders>
-              <w:top w:val="single" w:color="CCCCCC" w:sz="1"/>
-              <w:left w:val="single" w:color="CCCCCC" w:sz="1"/>
-              <w:bottom w:val="single" w:color="CCCCCC" w:sz="1"/>
-              <w:right w:val="single" w:color="CCCCCC" w:sz="1"/>
-            </w:tcBorders>
-            <w:shd w:fill="F5F8FF" w:val="clear"/>
-            <w:tcMar>
-              <w:top w:type="dxa" w:w="80"/>
-              <w:left w:type="dxa" w:w="120"/>
-              <w:bottom w:type="dxa" w:w="80"/>
-              <w:right w:type="dxa" w:w="120"/>
-            </w:tcMar>
-          </w:tcPr>
-          <w:p>
-            <w:r>
-              <w:rPr>
-                <w:rFonts w:ascii="Apple SD Gothic Neo" w:cs="Apple SD Gothic Neo" w:eastAsia="Apple SD Gothic Neo" w:hAnsi="Apple SD Gothic Neo"/>
-                <w:sz w:val="19"/>
-                <w:szCs w:val="19"/>
-              </w:rPr>
-              <w:t xml:space="preserve">Step 3 화면 캡처 — 검수포함</w:t>
+            <w:tcW w:type="dxa" w:w="4226"/>
+            <w:tcBorders>
+              <w:top w:val="single" w:color="CCCCCC" w:sz="1"/>
+              <w:left w:val="single" w:color="CCCCCC" w:sz="1"/>
+              <w:bottom w:val="single" w:color="CCCCCC" w:sz="1"/>
+              <w:right w:val="single" w:color="CCCCCC" w:sz="1"/>
+            </w:tcBorders>
+            <w:shd w:fill="F5F8FF" w:val="clear"/>
+            <w:tcMar>
+              <w:top w:type="dxa" w:w="80"/>
+              <w:left w:type="dxa" w:w="120"/>
+              <w:bottom w:type="dxa" w:w="80"/>
+              <w:right w:type="dxa" w:w="120"/>
+            </w:tcMar>
+          </w:tcPr>
+          <w:p>
+            <w:r>
+              <w:rPr>
+                <w:rFonts w:ascii="Apple SD Gothic Neo" w:cs="Apple SD Gothic Neo" w:eastAsia="Apple SD Gothic Neo" w:hAnsi="Apple SD Gothic Neo"/>
+                <w:sz w:val="19"/>
+                <w:szCs w:val="19"/>
+              </w:rPr>
+              <w:t xml:space="preserve">Step 3 화면 캡처 — 검수포함
+output/latest_run으로 RUN_ID 확인</w:t>
             </w:r>
           </w:p>
         </w:tc>
@@ -2589,7 +2860,7 @@
         </w:tc>
         <w:tc>
           <w:tcPr>
-            <w:tcW w:type="dxa" w:w="1800"/>
+            <w:tcW w:type="dxa" w:w="1600"/>
             <w:tcBorders>
               <w:top w:val="single" w:color="CCCCCC" w:sz="1"/>
               <w:left w:val="single" w:color="CCCCCC" w:sz="1"/>
@@ -2617,7 +2888,7 @@
         </w:tc>
         <w:tc>
           <w:tcPr>
-            <w:tcW w:type="dxa" w:w="4026"/>
+            <w:tcW w:type="dxa" w:w="4226"/>
             <w:tcBorders>
               <w:top w:val="single" w:color="CCCCCC" w:sz="1"/>
               <w:left w:val="single" w:color="CCCCCC" w:sz="1"/>
@@ -2675,7 +2946,7 @@
         </w:tc>
         <w:tc>
           <w:tcPr>
-            <w:tcW w:type="dxa" w:w="1800"/>
+            <w:tcW w:type="dxa" w:w="1600"/>
             <w:tcBorders>
               <w:top w:val="single" w:color="CCCCCC" w:sz="1"/>
               <w:left w:val="single" w:color="CCCCCC" w:sz="1"/>
@@ -2703,29 +2974,30 @@
         </w:tc>
         <w:tc>
           <w:tcPr>
-            <w:tcW w:type="dxa" w:w="4026"/>
-            <w:tcBorders>
-              <w:top w:val="single" w:color="CCCCCC" w:sz="1"/>
-              <w:left w:val="single" w:color="CCCCCC" w:sz="1"/>
-              <w:bottom w:val="single" w:color="CCCCCC" w:sz="1"/>
-              <w:right w:val="single" w:color="CCCCCC" w:sz="1"/>
-            </w:tcBorders>
-            <w:shd w:fill="F5F8FF" w:val="clear"/>
-            <w:tcMar>
-              <w:top w:type="dxa" w:w="80"/>
-              <w:left w:type="dxa" w:w="120"/>
-              <w:bottom w:type="dxa" w:w="80"/>
-              <w:right w:type="dxa" w:w="120"/>
-            </w:tcMar>
-          </w:tcPr>
-          <w:p>
-            <w:r>
-              <w:rPr>
-                <w:rFonts w:ascii="Apple SD Gothic Neo" w:cs="Apple SD Gothic Neo" w:eastAsia="Apple SD Gothic Neo" w:hAnsi="Apple SD Gothic Neo"/>
-                <w:sz w:val="19"/>
-                <w:szCs w:val="19"/>
-              </w:rPr>
-              <w:t xml:space="preserve">Step 4 최종 리포트 — 검수포함</w:t>
+            <w:tcW w:type="dxa" w:w="4226"/>
+            <w:tcBorders>
+              <w:top w:val="single" w:color="CCCCCC" w:sz="1"/>
+              <w:left w:val="single" w:color="CCCCCC" w:sz="1"/>
+              <w:bottom w:val="single" w:color="CCCCCC" w:sz="1"/>
+              <w:right w:val="single" w:color="CCCCCC" w:sz="1"/>
+            </w:tcBorders>
+            <w:shd w:fill="F5F8FF" w:val="clear"/>
+            <w:tcMar>
+              <w:top w:type="dxa" w:w="80"/>
+              <w:left w:type="dxa" w:w="120"/>
+              <w:bottom w:type="dxa" w:w="80"/>
+              <w:right w:type="dxa" w:w="120"/>
+            </w:tcMar>
+          </w:tcPr>
+          <w:p>
+            <w:r>
+              <w:rPr>
+                <w:rFonts w:ascii="Apple SD Gothic Neo" w:cs="Apple SD Gothic Neo" w:eastAsia="Apple SD Gothic Neo" w:hAnsi="Apple SD Gothic Neo"/>
+                <w:sz w:val="19"/>
+                <w:szCs w:val="19"/>
+              </w:rPr>
+              <w:t xml:space="preserve">Step 4 최종 리포트 — 검수포함
+output/latest_run으로 RUN_ID 확인</w:t>
             </w:r>
           </w:p>
         </w:tc>
@@ -2755,63 +3027,238 @@
                 <w:sz w:val="19"/>
                 <w:szCs w:val="19"/>
               </w:rPr>
+              <w:t xml:space="preserve">scripts/review_server.js</w:t>
+            </w:r>
+          </w:p>
+        </w:tc>
+        <w:tc>
+          <w:tcPr>
+            <w:tcW w:type="dxa" w:w="1600"/>
+            <w:tcBorders>
+              <w:top w:val="single" w:color="CCCCCC" w:sz="1"/>
+              <w:left w:val="single" w:color="CCCCCC" w:sz="1"/>
+              <w:bottom w:val="single" w:color="CCCCCC" w:sz="1"/>
+              <w:right w:val="single" w:color="CCCCCC" w:sz="1"/>
+            </w:tcBorders>
+            <w:shd w:fill="FFFFFF" w:val="clear"/>
+            <w:tcMar>
+              <w:top w:type="dxa" w:w="80"/>
+              <w:left w:type="dxa" w:w="120"/>
+              <w:bottom w:type="dxa" w:w="80"/>
+              <w:right w:type="dxa" w:w="120"/>
+            </w:tcMar>
+          </w:tcPr>
+          <w:p>
+            <w:r>
+              <w:rPr>
+                <w:rFonts w:ascii="Apple SD Gothic Neo" w:cs="Apple SD Gothic Neo" w:eastAsia="Apple SD Gothic Neo" w:hAnsi="Apple SD Gothic Neo"/>
+                <w:sz w:val="19"/>
+                <w:szCs w:val="19"/>
+              </w:rPr>
+              <w:t xml:space="preserve">사람</w:t>
+            </w:r>
+          </w:p>
+        </w:tc>
+        <w:tc>
+          <w:tcPr>
+            <w:tcW w:type="dxa" w:w="4226"/>
+            <w:tcBorders>
+              <w:top w:val="single" w:color="CCCCCC" w:sz="1"/>
+              <w:left w:val="single" w:color="CCCCCC" w:sz="1"/>
+              <w:bottom w:val="single" w:color="CCCCCC" w:sz="1"/>
+              <w:right w:val="single" w:color="CCCCCC" w:sz="1"/>
+            </w:tcBorders>
+            <w:shd w:fill="FFFFFF" w:val="clear"/>
+            <w:tcMar>
+              <w:top w:type="dxa" w:w="80"/>
+              <w:left w:type="dxa" w:w="120"/>
+              <w:bottom w:type="dxa" w:w="80"/>
+              <w:right w:type="dxa" w:w="120"/>
+            </w:tcMar>
+          </w:tcPr>
+          <w:p>
+            <w:r>
+              <w:rPr>
+                <w:rFonts w:ascii="Apple SD Gothic Neo" w:cs="Apple SD Gothic Neo" w:eastAsia="Apple SD Gothic Neo" w:hAnsi="Apple SD Gothic Neo"/>
+                <w:sz w:val="19"/>
+                <w:szCs w:val="19"/>
+              </w:rPr>
+              <w:t xml:space="preserve">Step 1 검수 웹 UI (node scripts/review_server.js)
+http://localhost:3000 에서 시나리오 검수·수정·커밋</w:t>
+            </w:r>
+          </w:p>
+        </w:tc>
+      </w:tr>
+      <w:tr>
+        <w:tc>
+          <w:tcPr>
+            <w:tcW w:type="dxa" w:w="3200"/>
+            <w:tcBorders>
+              <w:top w:val="single" w:color="CCCCCC" w:sz="1"/>
+              <w:left w:val="single" w:color="CCCCCC" w:sz="1"/>
+              <w:bottom w:val="single" w:color="CCCCCC" w:sz="1"/>
+              <w:right w:val="single" w:color="CCCCCC" w:sz="1"/>
+            </w:tcBorders>
+            <w:shd w:fill="F5F8FF" w:val="clear"/>
+            <w:tcMar>
+              <w:top w:type="dxa" w:w="80"/>
+              <w:left w:type="dxa" w:w="120"/>
+              <w:bottom w:type="dxa" w:w="80"/>
+              <w:right w:type="dxa" w:w="120"/>
+            </w:tcMar>
+          </w:tcPr>
+          <w:p>
+            <w:r>
+              <w:rPr>
+                <w:rFonts w:ascii="Apple SD Gothic Neo" w:cs="Apple SD Gothic Neo" w:eastAsia="Apple SD Gothic Neo" w:hAnsi="Apple SD Gothic Neo"/>
+                <w:sz w:val="19"/>
+                <w:szCs w:val="19"/>
+              </w:rPr>
               <w:t xml:space="preserve">scripts/update_pipeline_doc.js</w:t>
             </w:r>
           </w:p>
         </w:tc>
         <w:tc>
           <w:tcPr>
-            <w:tcW w:type="dxa" w:w="1800"/>
-            <w:tcBorders>
-              <w:top w:val="single" w:color="CCCCCC" w:sz="1"/>
-              <w:left w:val="single" w:color="CCCCCC" w:sz="1"/>
-              <w:bottom w:val="single" w:color="CCCCCC" w:sz="1"/>
-              <w:right w:val="single" w:color="CCCCCC" w:sz="1"/>
-            </w:tcBorders>
-            <w:shd w:fill="FFFFFF" w:val="clear"/>
-            <w:tcMar>
-              <w:top w:type="dxa" w:w="80"/>
-              <w:left w:type="dxa" w:w="120"/>
-              <w:bottom w:type="dxa" w:w="80"/>
-              <w:right w:type="dxa" w:w="120"/>
-            </w:tcMar>
-          </w:tcPr>
-          <w:p>
-            <w:r>
-              <w:rPr>
-                <w:rFonts w:ascii="Apple SD Gothic Neo" w:cs="Apple SD Gothic Neo" w:eastAsia="Apple SD Gothic Neo" w:hAnsi="Apple SD Gothic Neo"/>
-                <w:sz w:val="19"/>
-                <w:szCs w:val="19"/>
-              </w:rPr>
-              <w:t xml:space="preserve">Claude Code</w:t>
-            </w:r>
-          </w:p>
-        </w:tc>
-        <w:tc>
-          <w:tcPr>
-            <w:tcW w:type="dxa" w:w="4026"/>
-            <w:tcBorders>
-              <w:top w:val="single" w:color="CCCCCC" w:sz="1"/>
-              <w:left w:val="single" w:color="CCCCCC" w:sz="1"/>
-              <w:bottom w:val="single" w:color="CCCCCC" w:sz="1"/>
-              <w:right w:val="single" w:color="CCCCCC" w:sz="1"/>
-            </w:tcBorders>
-            <w:shd w:fill="FFFFFF" w:val="clear"/>
-            <w:tcMar>
-              <w:top w:type="dxa" w:w="80"/>
-              <w:left w:type="dxa" w:w="120"/>
-              <w:bottom w:type="dxa" w:w="80"/>
-              <w:right w:type="dxa" w:w="120"/>
-            </w:tcMar>
-          </w:tcPr>
-          <w:p>
-            <w:r>
-              <w:rPr>
-                <w:rFonts w:ascii="Apple SD Gothic Neo" w:cs="Apple SD Gothic Neo" w:eastAsia="Apple SD Gothic Neo" w:hAnsi="Apple SD Gothic Neo"/>
-                <w:sz w:val="19"/>
-                <w:szCs w:val="19"/>
-              </w:rPr>
-              <w:t xml:space="preserve">MD 변경 시 구성도 docx 자동 재생성</w:t>
+            <w:tcW w:type="dxa" w:w="1600"/>
+            <w:tcBorders>
+              <w:top w:val="single" w:color="CCCCCC" w:sz="1"/>
+              <w:left w:val="single" w:color="CCCCCC" w:sz="1"/>
+              <w:bottom w:val="single" w:color="CCCCCC" w:sz="1"/>
+              <w:right w:val="single" w:color="CCCCCC" w:sz="1"/>
+            </w:tcBorders>
+            <w:shd w:fill="F5F8FF" w:val="clear"/>
+            <w:tcMar>
+              <w:top w:type="dxa" w:w="80"/>
+              <w:left w:type="dxa" w:w="120"/>
+              <w:bottom w:type="dxa" w:w="80"/>
+              <w:right w:type="dxa" w:w="120"/>
+            </w:tcMar>
+          </w:tcPr>
+          <w:p>
+            <w:r>
+              <w:rPr>
+                <w:rFonts w:ascii="Apple SD Gothic Neo" w:cs="Apple SD Gothic Neo" w:eastAsia="Apple SD Gothic Neo" w:hAnsi="Apple SD Gothic Neo"/>
+                <w:sz w:val="19"/>
+                <w:szCs w:val="19"/>
+              </w:rPr>
+              <w:t xml:space="preserve">자동</w:t>
+            </w:r>
+          </w:p>
+        </w:tc>
+        <w:tc>
+          <w:tcPr>
+            <w:tcW w:type="dxa" w:w="4226"/>
+            <w:tcBorders>
+              <w:top w:val="single" w:color="CCCCCC" w:sz="1"/>
+              <w:left w:val="single" w:color="CCCCCC" w:sz="1"/>
+              <w:bottom w:val="single" w:color="CCCCCC" w:sz="1"/>
+              <w:right w:val="single" w:color="CCCCCC" w:sz="1"/>
+            </w:tcBorders>
+            <w:shd w:fill="F5F8FF" w:val="clear"/>
+            <w:tcMar>
+              <w:top w:type="dxa" w:w="80"/>
+              <w:left w:type="dxa" w:w="120"/>
+              <w:bottom w:type="dxa" w:w="80"/>
+              <w:right w:type="dxa" w:w="120"/>
+            </w:tcMar>
+          </w:tcPr>
+          <w:p>
+            <w:r>
+              <w:rPr>
+                <w:rFonts w:ascii="Apple SD Gothic Neo" w:cs="Apple SD Gothic Neo" w:eastAsia="Apple SD Gothic Neo" w:hAnsi="Apple SD Gothic Neo"/>
+                <w:sz w:val="19"/>
+                <w:szCs w:val="19"/>
+              </w:rPr>
+              <w:t xml:space="preserve">instructions/ MD 변경 시 구성도 docx 자동 재생성
+pre-commit 훅으로 자동 실행</w:t>
+            </w:r>
+          </w:p>
+        </w:tc>
+      </w:tr>
+      <w:tr>
+        <w:tc>
+          <w:tcPr>
+            <w:tcW w:type="dxa" w:w="3200"/>
+            <w:tcBorders>
+              <w:top w:val="single" w:color="CCCCCC" w:sz="1"/>
+              <w:left w:val="single" w:color="CCCCCC" w:sz="1"/>
+              <w:bottom w:val="single" w:color="CCCCCC" w:sz="1"/>
+              <w:right w:val="single" w:color="CCCCCC" w:sz="1"/>
+            </w:tcBorders>
+            <w:shd w:fill="FFFFFF" w:val="clear"/>
+            <w:tcMar>
+              <w:top w:type="dxa" w:w="80"/>
+              <w:left w:type="dxa" w:w="120"/>
+              <w:bottom w:type="dxa" w:w="80"/>
+              <w:right w:type="dxa" w:w="120"/>
+            </w:tcMar>
+          </w:tcPr>
+          <w:p>
+            <w:r>
+              <w:rPr>
+                <w:rFonts w:ascii="Apple SD Gothic Neo" w:cs="Apple SD Gothic Neo" w:eastAsia="Apple SD Gothic Neo" w:hAnsi="Apple SD Gothic Neo"/>
+                <w:sz w:val="19"/>
+                <w:szCs w:val="19"/>
+              </w:rPr>
+              <w:t xml:space="preserve">input/sample_docs/</w:t>
+            </w:r>
+          </w:p>
+        </w:tc>
+        <w:tc>
+          <w:tcPr>
+            <w:tcW w:type="dxa" w:w="1600"/>
+            <w:tcBorders>
+              <w:top w:val="single" w:color="CCCCCC" w:sz="1"/>
+              <w:left w:val="single" w:color="CCCCCC" w:sz="1"/>
+              <w:bottom w:val="single" w:color="CCCCCC" w:sz="1"/>
+              <w:right w:val="single" w:color="CCCCCC" w:sz="1"/>
+            </w:tcBorders>
+            <w:shd w:fill="FFFFFF" w:val="clear"/>
+            <w:tcMar>
+              <w:top w:type="dxa" w:w="80"/>
+              <w:left w:type="dxa" w:w="120"/>
+              <w:bottom w:type="dxa" w:w="80"/>
+              <w:right w:type="dxa" w:w="120"/>
+            </w:tcMar>
+          </w:tcPr>
+          <w:p>
+            <w:r>
+              <w:rPr>
+                <w:rFonts w:ascii="Apple SD Gothic Neo" w:cs="Apple SD Gothic Neo" w:eastAsia="Apple SD Gothic Neo" w:hAnsi="Apple SD Gothic Neo"/>
+                <w:sz w:val="19"/>
+                <w:szCs w:val="19"/>
+              </w:rPr>
+              <w:t xml:space="preserve">Step 1</w:t>
+            </w:r>
+          </w:p>
+        </w:tc>
+        <w:tc>
+          <w:tcPr>
+            <w:tcW w:type="dxa" w:w="4226"/>
+            <w:tcBorders>
+              <w:top w:val="single" w:color="CCCCCC" w:sz="1"/>
+              <w:left w:val="single" w:color="CCCCCC" w:sz="1"/>
+              <w:bottom w:val="single" w:color="CCCCCC" w:sz="1"/>
+              <w:right w:val="single" w:color="CCCCCC" w:sz="1"/>
+            </w:tcBorders>
+            <w:shd w:fill="FFFFFF" w:val="clear"/>
+            <w:tcMar>
+              <w:top w:type="dxa" w:w="80"/>
+              <w:left w:type="dxa" w:w="120"/>
+              <w:bottom w:type="dxa" w:w="80"/>
+              <w:right w:type="dxa" w:w="120"/>
+            </w:tcMar>
+          </w:tcPr>
+          <w:p>
+            <w:r>
+              <w:rPr>
+                <w:rFonts w:ascii="Apple SD Gothic Neo" w:cs="Apple SD Gothic Neo" w:eastAsia="Apple SD Gothic Neo" w:hAnsi="Apple SD Gothic Neo"/>
+                <w:sz w:val="19"/>
+                <w:szCs w:val="19"/>
+              </w:rPr>
+              <w:t xml:space="preserve">샘플 PDF — 실제 문서 구조·데이터 패턴 참고용
+Step 1 시나리오 생성 시 자동 반영</w:t>
             </w:r>
           </w:p>
         </w:tc>
@@ -3816,10 +4263,10 @@
         </w:tblBorders>
       </w:tblPr>
       <w:tblGrid>
-        <w:gridCol w:w="2000"/>
-        <w:gridCol w:w="2000"/>
-        <w:gridCol w:w="2800"/>
-        <w:gridCol w:w="2226"/>
+        <w:gridCol w:w="1800"/>
+        <w:gridCol w:w="1800"/>
+        <w:gridCol w:w="2600"/>
+        <w:gridCol w:w="2826"/>
       </w:tblGrid>
       <w:tr>
         <w:trPr>
@@ -3827,7 +4274,7 @@
         </w:trPr>
         <w:tc>
           <w:tcPr>
-            <w:tcW w:type="dxa" w:w="2000"/>
+            <w:tcW w:type="dxa" w:w="1800"/>
             <w:tcBorders>
               <w:top w:val="single" w:color="4472C4" w:sz="1"/>
               <w:left w:val="single" w:color="4472C4" w:sz="1"/>
@@ -3858,7 +4305,7 @@
         </w:tc>
         <w:tc>
           <w:tcPr>
-            <w:tcW w:type="dxa" w:w="2000"/>
+            <w:tcW w:type="dxa" w:w="1800"/>
             <w:tcBorders>
               <w:top w:val="single" w:color="4472C4" w:sz="1"/>
               <w:left w:val="single" w:color="4472C4" w:sz="1"/>
@@ -3889,7 +4336,7 @@
         </w:tc>
         <w:tc>
           <w:tcPr>
-            <w:tcW w:type="dxa" w:w="2800"/>
+            <w:tcW w:type="dxa" w:w="2600"/>
             <w:tcBorders>
               <w:top w:val="single" w:color="4472C4" w:sz="1"/>
               <w:left w:val="single" w:color="4472C4" w:sz="1"/>
@@ -3920,7 +4367,7 @@
         </w:tc>
         <w:tc>
           <w:tcPr>
-            <w:tcW w:type="dxa" w:w="2226"/>
+            <w:tcW w:type="dxa" w:w="2826"/>
             <w:tcBorders>
               <w:top w:val="single" w:color="4472C4" w:sz="1"/>
               <w:left w:val="single" w:color="4472C4" w:sz="1"/>
@@ -3953,7 +4400,7 @@
       <w:tr>
         <w:tc>
           <w:tcPr>
-            <w:tcW w:type="dxa" w:w="2000"/>
+            <w:tcW w:type="dxa" w:w="1800"/>
             <w:tcBorders>
               <w:top w:val="single" w:color="CCCCCC" w:sz="1"/>
               <w:left w:val="single" w:color="CCCCCC" w:sz="1"/>
@@ -3981,7 +4428,7 @@
         </w:tc>
         <w:tc>
           <w:tcPr>
-            <w:tcW w:type="dxa" w:w="2000"/>
+            <w:tcW w:type="dxa" w:w="1800"/>
             <w:tcBorders>
               <w:top w:val="single" w:color="CCCCCC" w:sz="1"/>
               <w:left w:val="single" w:color="CCCCCC" w:sz="1"/>
@@ -4009,58 +4456,60 @@
         </w:tc>
         <w:tc>
           <w:tcPr>
-            <w:tcW w:type="dxa" w:w="2800"/>
-            <w:tcBorders>
-              <w:top w:val="single" w:color="CCCCCC" w:sz="1"/>
-              <w:left w:val="single" w:color="CCCCCC" w:sz="1"/>
-              <w:bottom w:val="single" w:color="CCCCCC" w:sz="1"/>
-              <w:right w:val="single" w:color="CCCCCC" w:sz="1"/>
-            </w:tcBorders>
-            <w:shd w:fill="F5F8FF" w:val="clear"/>
-            <w:tcMar>
-              <w:top w:type="dxa" w:w="80"/>
-              <w:left w:type="dxa" w:w="120"/>
-              <w:bottom w:type="dxa" w:w="80"/>
-              <w:right w:type="dxa" w:w="120"/>
-            </w:tcMar>
-          </w:tcPr>
-          <w:p>
-            <w:r>
-              <w:rPr>
-                <w:rFonts w:ascii="Apple SD Gothic Neo" w:cs="Apple SD Gothic Neo" w:eastAsia="Apple SD Gothic Neo" w:hAnsi="Apple SD Gothic Neo"/>
-                <w:sz w:val="19"/>
-                <w:szCs w:val="19"/>
-              </w:rPr>
-              <w:t xml:space="preserve">input/frontend_code.zip
+            <w:tcW w:type="dxa" w:w="2600"/>
+            <w:tcBorders>
+              <w:top w:val="single" w:color="CCCCCC" w:sz="1"/>
+              <w:left w:val="single" w:color="CCCCCC" w:sz="1"/>
+              <w:bottom w:val="single" w:color="CCCCCC" w:sz="1"/>
+              <w:right w:val="single" w:color="CCCCCC" w:sz="1"/>
+            </w:tcBorders>
+            <w:shd w:fill="F5F8FF" w:val="clear"/>
+            <w:tcMar>
+              <w:top w:type="dxa" w:w="80"/>
+              <w:left w:type="dxa" w:w="120"/>
+              <w:bottom w:type="dxa" w:w="80"/>
+              <w:right w:type="dxa" w:w="120"/>
+            </w:tcMar>
+          </w:tcPr>
+          <w:p>
+            <w:r>
+              <w:rPr>
+                <w:rFonts w:ascii="Apple SD Gothic Neo" w:cs="Apple SD Gothic Neo" w:eastAsia="Apple SD Gothic Neo" w:hAnsi="Apple SD Gothic Neo"/>
+                <w:sz w:val="19"/>
+                <w:szCs w:val="19"/>
+              </w:rPr>
+              <w:t xml:space="preserve">input/frontend_code/ (zip)
+input/sample_docs/ (PDF)
 instructions/ (MD 파일)</w:t>
             </w:r>
           </w:p>
         </w:tc>
         <w:tc>
           <w:tcPr>
-            <w:tcW w:type="dxa" w:w="2226"/>
-            <w:tcBorders>
-              <w:top w:val="single" w:color="CCCCCC" w:sz="1"/>
-              <w:left w:val="single" w:color="CCCCCC" w:sz="1"/>
-              <w:bottom w:val="single" w:color="CCCCCC" w:sz="1"/>
-              <w:right w:val="single" w:color="CCCCCC" w:sz="1"/>
-            </w:tcBorders>
-            <w:shd w:fill="F5F8FF" w:val="clear"/>
-            <w:tcMar>
-              <w:top w:type="dxa" w:w="80"/>
-              <w:left w:type="dxa" w:w="120"/>
-              <w:bottom w:type="dxa" w:w="80"/>
-              <w:right w:type="dxa" w:w="120"/>
-            </w:tcMar>
-          </w:tcPr>
-          <w:p>
-            <w:r>
-              <w:rPr>
-                <w:rFonts w:ascii="Apple SD Gothic Neo" w:cs="Apple SD Gothic Neo" w:eastAsia="Apple SD Gothic Neo" w:hAnsi="Apple SD Gothic Neo"/>
-                <w:sz w:val="19"/>
-                <w:szCs w:val="19"/>
-              </w:rPr>
-              <w:t xml:space="preserve">1회 설정</w:t>
+            <w:tcW w:type="dxa" w:w="2826"/>
+            <w:tcBorders>
+              <w:top w:val="single" w:color="CCCCCC" w:sz="1"/>
+              <w:left w:val="single" w:color="CCCCCC" w:sz="1"/>
+              <w:bottom w:val="single" w:color="CCCCCC" w:sz="1"/>
+              <w:right w:val="single" w:color="CCCCCC" w:sz="1"/>
+            </w:tcBorders>
+            <w:shd w:fill="F5F8FF" w:val="clear"/>
+            <w:tcMar>
+              <w:top w:type="dxa" w:w="80"/>
+              <w:left w:type="dxa" w:w="120"/>
+              <w:bottom w:type="dxa" w:w="80"/>
+              <w:right w:type="dxa" w:w="120"/>
+            </w:tcMar>
+          </w:tcPr>
+          <w:p>
+            <w:r>
+              <w:rPr>
+                <w:rFonts w:ascii="Apple SD Gothic Neo" w:cs="Apple SD Gothic Neo" w:eastAsia="Apple SD Gothic Neo" w:hAnsi="Apple SD Gothic Neo"/>
+                <w:sz w:val="19"/>
+                <w:szCs w:val="19"/>
+              </w:rPr>
+              <w:t xml:space="preserve">1회 설정
+또는 새 프로젝트 시</w:t>
             </w:r>
           </w:p>
         </w:tc>
@@ -4068,7 +4517,7 @@
       <w:tr>
         <w:tc>
           <w:tcPr>
-            <w:tcW w:type="dxa" w:w="2000"/>
+            <w:tcW w:type="dxa" w:w="1800"/>
             <w:tcBorders>
               <w:top w:val="single" w:color="CCCCCC" w:sz="1"/>
               <w:left w:val="single" w:color="CCCCCC" w:sz="1"/>
@@ -4096,7 +4545,7 @@
         </w:tc>
         <w:tc>
           <w:tcPr>
-            <w:tcW w:type="dxa" w:w="2000"/>
+            <w:tcW w:type="dxa" w:w="1800"/>
             <w:tcBorders>
               <w:top w:val="single" w:color="CCCCCC" w:sz="1"/>
               <w:left w:val="single" w:color="CCCCCC" w:sz="1"/>
@@ -4124,58 +4573,60 @@
         </w:tc>
         <w:tc>
           <w:tcPr>
-            <w:tcW w:type="dxa" w:w="2800"/>
-            <w:tcBorders>
-              <w:top w:val="single" w:color="CCCCCC" w:sz="1"/>
-              <w:left w:val="single" w:color="CCCCCC" w:sz="1"/>
-              <w:bottom w:val="single" w:color="CCCCCC" w:sz="1"/>
-              <w:right w:val="single" w:color="CCCCCC" w:sz="1"/>
-            </w:tcBorders>
-            <w:shd w:fill="FFFFFF" w:val="clear"/>
-            <w:tcMar>
-              <w:top w:type="dxa" w:w="80"/>
-              <w:left w:type="dxa" w:w="120"/>
-              <w:bottom w:type="dxa" w:w="80"/>
-              <w:right w:type="dxa" w:w="120"/>
-            </w:tcMar>
-          </w:tcPr>
-          <w:p>
-            <w:r>
-              <w:rPr>
-                <w:rFonts w:ascii="Apple SD Gothic Neo" w:cs="Apple SD Gothic Neo" w:eastAsia="Apple SD Gothic Neo" w:hAnsi="Apple SD Gothic Neo"/>
-                <w:sz w:val="19"/>
-                <w:szCs w:val="19"/>
-              </w:rPr>
-              <w:t xml:space="preserve">input/figma_frames/
-output/step1/</w:t>
-            </w:r>
-          </w:p>
-        </w:tc>
-        <w:tc>
-          <w:tcPr>
-            <w:tcW w:type="dxa" w:w="2226"/>
-            <w:tcBorders>
-              <w:top w:val="single" w:color="CCCCCC" w:sz="1"/>
-              <w:left w:val="single" w:color="CCCCCC" w:sz="1"/>
-              <w:bottom w:val="single" w:color="CCCCCC" w:sz="1"/>
-              <w:right w:val="single" w:color="CCCCCC" w:sz="1"/>
-            </w:tcBorders>
-            <w:shd w:fill="FFFFFF" w:val="clear"/>
-            <w:tcMar>
-              <w:top w:type="dxa" w:w="80"/>
-              <w:left w:type="dxa" w:w="120"/>
-              <w:bottom w:type="dxa" w:w="80"/>
-              <w:right w:type="dxa" w:w="120"/>
-            </w:tcMar>
-          </w:tcPr>
-          <w:p>
-            <w:r>
-              <w:rPr>
-                <w:rFonts w:ascii="Apple SD Gothic Neo" w:cs="Apple SD Gothic Neo" w:eastAsia="Apple SD Gothic Neo" w:hAnsi="Apple SD Gothic Neo"/>
-                <w:sz w:val="19"/>
-                <w:szCs w:val="19"/>
-              </w:rPr>
-              <w:t xml:space="preserve">로컬 실행</w:t>
+            <w:tcW w:type="dxa" w:w="2600"/>
+            <w:tcBorders>
+              <w:top w:val="single" w:color="CCCCCC" w:sz="1"/>
+              <w:left w:val="single" w:color="CCCCCC" w:sz="1"/>
+              <w:bottom w:val="single" w:color="CCCCCC" w:sz="1"/>
+              <w:right w:val="single" w:color="CCCCCC" w:sz="1"/>
+            </w:tcBorders>
+            <w:shd w:fill="FFFFFF" w:val="clear"/>
+            <w:tcMar>
+              <w:top w:type="dxa" w:w="80"/>
+              <w:left w:type="dxa" w:w="120"/>
+              <w:bottom w:type="dxa" w:w="80"/>
+              <w:right w:type="dxa" w:w="120"/>
+            </w:tcMar>
+          </w:tcPr>
+          <w:p>
+            <w:r>
+              <w:rPr>
+                <w:rFonts w:ascii="Apple SD Gothic Neo" w:cs="Apple SD Gothic Neo" w:eastAsia="Apple SD Gothic Neo" w:hAnsi="Apple SD Gothic Neo"/>
+                <w:sz w:val="19"/>
+                <w:szCs w:val="19"/>
+              </w:rPr>
+              <w:t xml:space="preserve">input/figma_frames/$RUN_ID/
+output/step1/$RUN_ID/
+output/step1/run_log.md</w:t>
+            </w:r>
+          </w:p>
+        </w:tc>
+        <w:tc>
+          <w:tcPr>
+            <w:tcW w:type="dxa" w:w="2826"/>
+            <w:tcBorders>
+              <w:top w:val="single" w:color="CCCCCC" w:sz="1"/>
+              <w:left w:val="single" w:color="CCCCCC" w:sz="1"/>
+              <w:bottom w:val="single" w:color="CCCCCC" w:sz="1"/>
+              <w:right w:val="single" w:color="CCCCCC" w:sz="1"/>
+            </w:tcBorders>
+            <w:shd w:fill="FFFFFF" w:val="clear"/>
+            <w:tcMar>
+              <w:top w:type="dxa" w:w="80"/>
+              <w:left w:type="dxa" w:w="120"/>
+              <w:bottom w:type="dxa" w:w="80"/>
+              <w:right w:type="dxa" w:w="120"/>
+            </w:tcMar>
+          </w:tcPr>
+          <w:p>
+            <w:r>
+              <w:rPr>
+                <w:rFonts w:ascii="Apple SD Gothic Neo" w:cs="Apple SD Gothic Neo" w:eastAsia="Apple SD Gothic Neo" w:hAnsi="Apple SD Gothic Neo"/>
+                <w:sz w:val="19"/>
+                <w:szCs w:val="19"/>
+              </w:rPr>
+              <w:t xml:space="preserve">로컬 실행
+RUN_ID=$(date +%y%m%d%H%M)</w:t>
             </w:r>
           </w:p>
         </w:tc>
@@ -4183,113 +4634,115 @@
       <w:tr>
         <w:tc>
           <w:tcPr>
-            <w:tcW w:type="dxa" w:w="2000"/>
-            <w:tcBorders>
-              <w:top w:val="single" w:color="CCCCCC" w:sz="1"/>
-              <w:left w:val="single" w:color="CCCCCC" w:sz="1"/>
-              <w:bottom w:val="single" w:color="CCCCCC" w:sz="1"/>
-              <w:right w:val="single" w:color="CCCCCC" w:sz="1"/>
-            </w:tcBorders>
-            <w:shd w:fill="F5F8FF" w:val="clear"/>
-            <w:tcMar>
-              <w:top w:type="dxa" w:w="80"/>
-              <w:left w:type="dxa" w:w="120"/>
-              <w:bottom w:type="dxa" w:w="80"/>
-              <w:right w:type="dxa" w:w="120"/>
-            </w:tcMar>
-          </w:tcPr>
-          <w:p>
-            <w:r>
-              <w:rPr>
-                <w:rFonts w:ascii="Apple SD Gothic Neo" w:cs="Apple SD Gothic Neo" w:eastAsia="Apple SD Gothic Neo" w:hAnsi="Apple SD Gothic Neo"/>
-                <w:sz w:val="19"/>
-                <w:szCs w:val="19"/>
-              </w:rPr>
-              <w:t xml:space="preserve">Step 2 Manus</w:t>
-            </w:r>
-          </w:p>
-        </w:tc>
-        <w:tc>
-          <w:tcPr>
-            <w:tcW w:type="dxa" w:w="2000"/>
-            <w:tcBorders>
-              <w:top w:val="single" w:color="CCCCCC" w:sz="1"/>
-              <w:left w:val="single" w:color="CCCCCC" w:sz="1"/>
-              <w:bottom w:val="single" w:color="CCCCCC" w:sz="1"/>
-              <w:right w:val="single" w:color="CCCCCC" w:sz="1"/>
-            </w:tcBorders>
-            <w:shd w:fill="F5F8FF" w:val="clear"/>
-            <w:tcMar>
-              <w:top w:type="dxa" w:w="80"/>
-              <w:left w:type="dxa" w:w="120"/>
-              <w:bottom w:type="dxa" w:w="80"/>
-              <w:right w:type="dxa" w:w="120"/>
-            </w:tcMar>
-          </w:tcPr>
-          <w:p>
-            <w:r>
-              <w:rPr>
-                <w:rFonts w:ascii="Apple SD Gothic Neo" w:cs="Apple SD Gothic Neo" w:eastAsia="Apple SD Gothic Neo" w:hAnsi="Apple SD Gothic Neo"/>
-                <w:sz w:val="19"/>
-                <w:szCs w:val="19"/>
-              </w:rPr>
-              <w:t xml:space="preserve">clone → 작업 → push</w:t>
-            </w:r>
-          </w:p>
-        </w:tc>
-        <w:tc>
-          <w:tcPr>
-            <w:tcW w:type="dxa" w:w="2800"/>
-            <w:tcBorders>
-              <w:top w:val="single" w:color="CCCCCC" w:sz="1"/>
-              <w:left w:val="single" w:color="CCCCCC" w:sz="1"/>
-              <w:bottom w:val="single" w:color="CCCCCC" w:sz="1"/>
-              <w:right w:val="single" w:color="CCCCCC" w:sz="1"/>
-            </w:tcBorders>
-            <w:shd w:fill="F5F8FF" w:val="clear"/>
-            <w:tcMar>
-              <w:top w:type="dxa" w:w="80"/>
-              <w:left w:type="dxa" w:w="120"/>
-              <w:bottom w:type="dxa" w:w="80"/>
-              <w:right w:type="dxa" w:w="120"/>
-            </w:tcMar>
-          </w:tcPr>
-          <w:p>
-            <w:r>
-              <w:rPr>
-                <w:rFonts w:ascii="Apple SD Gothic Neo" w:cs="Apple SD Gothic Neo" w:eastAsia="Apple SD Gothic Neo" w:hAnsi="Apple SD Gothic Neo"/>
-                <w:sz w:val="19"/>
-                <w:szCs w:val="19"/>
-              </w:rPr>
-              <w:t xml:space="preserve">output/step2/</w:t>
-            </w:r>
-          </w:p>
-        </w:tc>
-        <w:tc>
-          <w:tcPr>
-            <w:tcW w:type="dxa" w:w="2226"/>
-            <w:tcBorders>
-              <w:top w:val="single" w:color="CCCCCC" w:sz="1"/>
-              <w:left w:val="single" w:color="CCCCCC" w:sz="1"/>
-              <w:bottom w:val="single" w:color="CCCCCC" w:sz="1"/>
-              <w:right w:val="single" w:color="CCCCCC" w:sz="1"/>
-            </w:tcBorders>
-            <w:shd w:fill="F5F8FF" w:val="clear"/>
-            <w:tcMar>
-              <w:top w:type="dxa" w:w="80"/>
-              <w:left w:type="dxa" w:w="120"/>
-              <w:bottom w:type="dxa" w:w="80"/>
-              <w:right w:type="dxa" w:w="120"/>
-            </w:tcMar>
-          </w:tcPr>
-          <w:p>
-            <w:r>
-              <w:rPr>
-                <w:rFonts w:ascii="Apple SD Gothic Neo" w:cs="Apple SD Gothic Neo" w:eastAsia="Apple SD Gothic Neo" w:hAnsi="Apple SD Gothic Neo"/>
-                <w:sz w:val="19"/>
-                <w:szCs w:val="19"/>
-              </w:rPr>
-              <w:t xml:space="preserve">GitHub PAT 필요</w:t>
+            <w:tcW w:type="dxa" w:w="1800"/>
+            <w:tcBorders>
+              <w:top w:val="single" w:color="CCCCCC" w:sz="1"/>
+              <w:left w:val="single" w:color="CCCCCC" w:sz="1"/>
+              <w:bottom w:val="single" w:color="CCCCCC" w:sz="1"/>
+              <w:right w:val="single" w:color="CCCCCC" w:sz="1"/>
+            </w:tcBorders>
+            <w:shd w:fill="F5F8FF" w:val="clear"/>
+            <w:tcMar>
+              <w:top w:type="dxa" w:w="80"/>
+              <w:left w:type="dxa" w:w="120"/>
+              <w:bottom w:type="dxa" w:w="80"/>
+              <w:right w:type="dxa" w:w="120"/>
+            </w:tcMar>
+          </w:tcPr>
+          <w:p>
+            <w:r>
+              <w:rPr>
+                <w:rFonts w:ascii="Apple SD Gothic Neo" w:cs="Apple SD Gothic Neo" w:eastAsia="Apple SD Gothic Neo" w:hAnsi="Apple SD Gothic Neo"/>
+                <w:sz w:val="19"/>
+                <w:szCs w:val="19"/>
+              </w:rPr>
+              <w:t xml:space="preserve">사람 (검수)</w:t>
+            </w:r>
+          </w:p>
+        </w:tc>
+        <w:tc>
+          <w:tcPr>
+            <w:tcW w:type="dxa" w:w="1800"/>
+            <w:tcBorders>
+              <w:top w:val="single" w:color="CCCCCC" w:sz="1"/>
+              <w:left w:val="single" w:color="CCCCCC" w:sz="1"/>
+              <w:bottom w:val="single" w:color="CCCCCC" w:sz="1"/>
+              <w:right w:val="single" w:color="CCCCCC" w:sz="1"/>
+            </w:tcBorders>
+            <w:shd w:fill="F5F8FF" w:val="clear"/>
+            <w:tcMar>
+              <w:top w:type="dxa" w:w="80"/>
+              <w:left w:type="dxa" w:w="120"/>
+              <w:bottom w:type="dxa" w:w="80"/>
+              <w:right w:type="dxa" w:w="120"/>
+            </w:tcMar>
+          </w:tcPr>
+          <w:p>
+            <w:r>
+              <w:rPr>
+                <w:rFonts w:ascii="Apple SD Gothic Neo" w:cs="Apple SD Gothic Neo" w:eastAsia="Apple SD Gothic Neo" w:hAnsi="Apple SD Gothic Neo"/>
+                <w:sz w:val="19"/>
+                <w:szCs w:val="19"/>
+              </w:rPr>
+              <w:t xml:space="preserve">검수 UI → 저장&amp;커밋</w:t>
+            </w:r>
+          </w:p>
+        </w:tc>
+        <w:tc>
+          <w:tcPr>
+            <w:tcW w:type="dxa" w:w="2600"/>
+            <w:tcBorders>
+              <w:top w:val="single" w:color="CCCCCC" w:sz="1"/>
+              <w:left w:val="single" w:color="CCCCCC" w:sz="1"/>
+              <w:bottom w:val="single" w:color="CCCCCC" w:sz="1"/>
+              <w:right w:val="single" w:color="CCCCCC" w:sz="1"/>
+            </w:tcBorders>
+            <w:shd w:fill="F5F8FF" w:val="clear"/>
+            <w:tcMar>
+              <w:top w:type="dxa" w:w="80"/>
+              <w:left w:type="dxa" w:w="120"/>
+              <w:bottom w:type="dxa" w:w="80"/>
+              <w:right w:type="dxa" w:w="120"/>
+            </w:tcMar>
+          </w:tcPr>
+          <w:p>
+            <w:r>
+              <w:rPr>
+                <w:rFonts w:ascii="Apple SD Gothic Neo" w:cs="Apple SD Gothic Neo" w:eastAsia="Apple SD Gothic Neo" w:hAnsi="Apple SD Gothic Neo"/>
+                <w:sz w:val="19"/>
+                <w:szCs w:val="19"/>
+              </w:rPr>
+              <w:t xml:space="preserve">output/step1/$RUN_ID/ (수정)
+output/latest_run</w:t>
+            </w:r>
+          </w:p>
+        </w:tc>
+        <w:tc>
+          <w:tcPr>
+            <w:tcW w:type="dxa" w:w="2826"/>
+            <w:tcBorders>
+              <w:top w:val="single" w:color="CCCCCC" w:sz="1"/>
+              <w:left w:val="single" w:color="CCCCCC" w:sz="1"/>
+              <w:bottom w:val="single" w:color="CCCCCC" w:sz="1"/>
+              <w:right w:val="single" w:color="CCCCCC" w:sz="1"/>
+            </w:tcBorders>
+            <w:shd w:fill="F5F8FF" w:val="clear"/>
+            <w:tcMar>
+              <w:top w:type="dxa" w:w="80"/>
+              <w:left w:type="dxa" w:w="120"/>
+              <w:bottom w:type="dxa" w:w="80"/>
+              <w:right w:type="dxa" w:w="120"/>
+            </w:tcMar>
+          </w:tcPr>
+          <w:p>
+            <w:r>
+              <w:rPr>
+                <w:rFonts w:ascii="Apple SD Gothic Neo" w:cs="Apple SD Gothic Neo" w:eastAsia="Apple SD Gothic Neo" w:hAnsi="Apple SD Gothic Neo"/>
+                <w:sz w:val="19"/>
+                <w:szCs w:val="19"/>
+              </w:rPr>
+              <w:t xml:space="preserve">node scripts/review_server.js
+http://localhost:3000</w:t>
             </w:r>
           </w:p>
         </w:tc>
@@ -4297,114 +4750,114 @@
       <w:tr>
         <w:tc>
           <w:tcPr>
-            <w:tcW w:type="dxa" w:w="2000"/>
-            <w:tcBorders>
-              <w:top w:val="single" w:color="CCCCCC" w:sz="1"/>
-              <w:left w:val="single" w:color="CCCCCC" w:sz="1"/>
-              <w:bottom w:val="single" w:color="CCCCCC" w:sz="1"/>
-              <w:right w:val="single" w:color="CCCCCC" w:sz="1"/>
-            </w:tcBorders>
-            <w:shd w:fill="FFFFFF" w:val="clear"/>
-            <w:tcMar>
-              <w:top w:type="dxa" w:w="80"/>
-              <w:left w:type="dxa" w:w="120"/>
-              <w:bottom w:type="dxa" w:w="80"/>
-              <w:right w:type="dxa" w:w="120"/>
-            </w:tcMar>
-          </w:tcPr>
-          <w:p>
-            <w:r>
-              <w:rPr>
-                <w:rFonts w:ascii="Apple SD Gothic Neo" w:cs="Apple SD Gothic Neo" w:eastAsia="Apple SD Gothic Neo" w:hAnsi="Apple SD Gothic Neo"/>
-                <w:sz w:val="19"/>
-                <w:szCs w:val="19"/>
-              </w:rPr>
-              <w:t xml:space="preserve">Step 3 Claude Code</w:t>
-            </w:r>
-          </w:p>
-        </w:tc>
-        <w:tc>
-          <w:tcPr>
-            <w:tcW w:type="dxa" w:w="2000"/>
-            <w:tcBorders>
-              <w:top w:val="single" w:color="CCCCCC" w:sz="1"/>
-              <w:left w:val="single" w:color="CCCCCC" w:sz="1"/>
-              <w:bottom w:val="single" w:color="CCCCCC" w:sz="1"/>
-              <w:right w:val="single" w:color="CCCCCC" w:sz="1"/>
-            </w:tcBorders>
-            <w:shd w:fill="FFFFFF" w:val="clear"/>
-            <w:tcMar>
-              <w:top w:type="dxa" w:w="80"/>
-              <w:left w:type="dxa" w:w="120"/>
-              <w:bottom w:type="dxa" w:w="80"/>
-              <w:right w:type="dxa" w:w="120"/>
-            </w:tcMar>
-          </w:tcPr>
-          <w:p>
-            <w:r>
-              <w:rPr>
-                <w:rFonts w:ascii="Apple SD Gothic Neo" w:cs="Apple SD Gothic Neo" w:eastAsia="Apple SD Gothic Neo" w:hAnsi="Apple SD Gothic Neo"/>
-                <w:sz w:val="19"/>
-                <w:szCs w:val="19"/>
-              </w:rPr>
-              <w:t xml:space="preserve">pull → 작업 → push</w:t>
-            </w:r>
-          </w:p>
-        </w:tc>
-        <w:tc>
-          <w:tcPr>
-            <w:tcW w:type="dxa" w:w="2800"/>
-            <w:tcBorders>
-              <w:top w:val="single" w:color="CCCCCC" w:sz="1"/>
-              <w:left w:val="single" w:color="CCCCCC" w:sz="1"/>
-              <w:bottom w:val="single" w:color="CCCCCC" w:sz="1"/>
-              <w:right w:val="single" w:color="CCCCCC" w:sz="1"/>
-            </w:tcBorders>
-            <w:shd w:fill="FFFFFF" w:val="clear"/>
-            <w:tcMar>
-              <w:top w:type="dxa" w:w="80"/>
-              <w:left w:type="dxa" w:w="120"/>
-              <w:bottom w:type="dxa" w:w="80"/>
-              <w:right w:type="dxa" w:w="120"/>
-            </w:tcMar>
-          </w:tcPr>
-          <w:p>
-            <w:r>
-              <w:rPr>
-                <w:rFonts w:ascii="Apple SD Gothic Neo" w:cs="Apple SD Gothic Neo" w:eastAsia="Apple SD Gothic Neo" w:hAnsi="Apple SD Gothic Neo"/>
-                <w:sz w:val="19"/>
-                <w:szCs w:val="19"/>
-              </w:rPr>
-              <w:t xml:space="preserve">output/step3/
-scripts/capture.py</w:t>
-            </w:r>
-          </w:p>
-        </w:tc>
-        <w:tc>
-          <w:tcPr>
-            <w:tcW w:type="dxa" w:w="2226"/>
-            <w:tcBorders>
-              <w:top w:val="single" w:color="CCCCCC" w:sz="1"/>
-              <w:left w:val="single" w:color="CCCCCC" w:sz="1"/>
-              <w:bottom w:val="single" w:color="CCCCCC" w:sz="1"/>
-              <w:right w:val="single" w:color="CCCCCC" w:sz="1"/>
-            </w:tcBorders>
-            <w:shd w:fill="FFFFFF" w:val="clear"/>
-            <w:tcMar>
-              <w:top w:type="dxa" w:w="80"/>
-              <w:left w:type="dxa" w:w="120"/>
-              <w:bottom w:type="dxa" w:w="80"/>
-              <w:right w:type="dxa" w:w="120"/>
-            </w:tcMar>
-          </w:tcPr>
-          <w:p>
-            <w:r>
-              <w:rPr>
-                <w:rFonts w:ascii="Apple SD Gothic Neo" w:cs="Apple SD Gothic Neo" w:eastAsia="Apple SD Gothic Neo" w:hAnsi="Apple SD Gothic Neo"/>
-                <w:sz w:val="19"/>
-                <w:szCs w:val="19"/>
-              </w:rPr>
-              <w:t xml:space="preserve">Playwright 로컬 실행</w:t>
+            <w:tcW w:type="dxa" w:w="1800"/>
+            <w:tcBorders>
+              <w:top w:val="single" w:color="CCCCCC" w:sz="1"/>
+              <w:left w:val="single" w:color="CCCCCC" w:sz="1"/>
+              <w:bottom w:val="single" w:color="CCCCCC" w:sz="1"/>
+              <w:right w:val="single" w:color="CCCCCC" w:sz="1"/>
+            </w:tcBorders>
+            <w:shd w:fill="FFFFFF" w:val="clear"/>
+            <w:tcMar>
+              <w:top w:type="dxa" w:w="80"/>
+              <w:left w:type="dxa" w:w="120"/>
+              <w:bottom w:type="dxa" w:w="80"/>
+              <w:right w:type="dxa" w:w="120"/>
+            </w:tcMar>
+          </w:tcPr>
+          <w:p>
+            <w:r>
+              <w:rPr>
+                <w:rFonts w:ascii="Apple SD Gothic Neo" w:cs="Apple SD Gothic Neo" w:eastAsia="Apple SD Gothic Neo" w:hAnsi="Apple SD Gothic Neo"/>
+                <w:sz w:val="19"/>
+                <w:szCs w:val="19"/>
+              </w:rPr>
+              <w:t xml:space="preserve">Step 2 Manus</w:t>
+            </w:r>
+          </w:p>
+        </w:tc>
+        <w:tc>
+          <w:tcPr>
+            <w:tcW w:type="dxa" w:w="1800"/>
+            <w:tcBorders>
+              <w:top w:val="single" w:color="CCCCCC" w:sz="1"/>
+              <w:left w:val="single" w:color="CCCCCC" w:sz="1"/>
+              <w:bottom w:val="single" w:color="CCCCCC" w:sz="1"/>
+              <w:right w:val="single" w:color="CCCCCC" w:sz="1"/>
+            </w:tcBorders>
+            <w:shd w:fill="FFFFFF" w:val="clear"/>
+            <w:tcMar>
+              <w:top w:type="dxa" w:w="80"/>
+              <w:left w:type="dxa" w:w="120"/>
+              <w:bottom w:type="dxa" w:w="80"/>
+              <w:right w:type="dxa" w:w="120"/>
+            </w:tcMar>
+          </w:tcPr>
+          <w:p>
+            <w:r>
+              <w:rPr>
+                <w:rFonts w:ascii="Apple SD Gothic Neo" w:cs="Apple SD Gothic Neo" w:eastAsia="Apple SD Gothic Neo" w:hAnsi="Apple SD Gothic Neo"/>
+                <w:sz w:val="19"/>
+                <w:szCs w:val="19"/>
+              </w:rPr>
+              <w:t xml:space="preserve">clone → 작업 → push</w:t>
+            </w:r>
+          </w:p>
+        </w:tc>
+        <w:tc>
+          <w:tcPr>
+            <w:tcW w:type="dxa" w:w="2600"/>
+            <w:tcBorders>
+              <w:top w:val="single" w:color="CCCCCC" w:sz="1"/>
+              <w:left w:val="single" w:color="CCCCCC" w:sz="1"/>
+              <w:bottom w:val="single" w:color="CCCCCC" w:sz="1"/>
+              <w:right w:val="single" w:color="CCCCCC" w:sz="1"/>
+            </w:tcBorders>
+            <w:shd w:fill="FFFFFF" w:val="clear"/>
+            <w:tcMar>
+              <w:top w:type="dxa" w:w="80"/>
+              <w:left w:type="dxa" w:w="120"/>
+              <w:bottom w:type="dxa" w:w="80"/>
+              <w:right w:type="dxa" w:w="120"/>
+            </w:tcMar>
+          </w:tcPr>
+          <w:p>
+            <w:r>
+              <w:rPr>
+                <w:rFonts w:ascii="Apple SD Gothic Neo" w:cs="Apple SD Gothic Neo" w:eastAsia="Apple SD Gothic Neo" w:hAnsi="Apple SD Gothic Neo"/>
+                <w:sz w:val="19"/>
+                <w:szCs w:val="19"/>
+              </w:rPr>
+              <w:t xml:space="preserve">output/step2/$RUN_ID/</w:t>
+            </w:r>
+          </w:p>
+        </w:tc>
+        <w:tc>
+          <w:tcPr>
+            <w:tcW w:type="dxa" w:w="2826"/>
+            <w:tcBorders>
+              <w:top w:val="single" w:color="CCCCCC" w:sz="1"/>
+              <w:left w:val="single" w:color="CCCCCC" w:sz="1"/>
+              <w:bottom w:val="single" w:color="CCCCCC" w:sz="1"/>
+              <w:right w:val="single" w:color="CCCCCC" w:sz="1"/>
+            </w:tcBorders>
+            <w:shd w:fill="FFFFFF" w:val="clear"/>
+            <w:tcMar>
+              <w:top w:type="dxa" w:w="80"/>
+              <w:left w:type="dxa" w:w="120"/>
+              <w:bottom w:type="dxa" w:w="80"/>
+              <w:right w:type="dxa" w:w="120"/>
+            </w:tcMar>
+          </w:tcPr>
+          <w:p>
+            <w:r>
+              <w:rPr>
+                <w:rFonts w:ascii="Apple SD Gothic Neo" w:cs="Apple SD Gothic Neo" w:eastAsia="Apple SD Gothic Neo" w:hAnsi="Apple SD Gothic Neo"/>
+                <w:sz w:val="19"/>
+                <w:szCs w:val="19"/>
+              </w:rPr>
+              <w:t xml:space="preserve">GitHub PAT 필요
+RUN_ID=$(cat output/latest_run)</w:t>
             </w:r>
           </w:p>
         </w:tc>
@@ -4412,35 +4865,35 @@
       <w:tr>
         <w:tc>
           <w:tcPr>
-            <w:tcW w:type="dxa" w:w="2000"/>
-            <w:tcBorders>
-              <w:top w:val="single" w:color="CCCCCC" w:sz="1"/>
-              <w:left w:val="single" w:color="CCCCCC" w:sz="1"/>
-              <w:bottom w:val="single" w:color="CCCCCC" w:sz="1"/>
-              <w:right w:val="single" w:color="CCCCCC" w:sz="1"/>
-            </w:tcBorders>
-            <w:shd w:fill="F5F8FF" w:val="clear"/>
-            <w:tcMar>
-              <w:top w:type="dxa" w:w="80"/>
-              <w:left w:type="dxa" w:w="120"/>
-              <w:bottom w:type="dxa" w:w="80"/>
-              <w:right w:type="dxa" w:w="120"/>
-            </w:tcMar>
-          </w:tcPr>
-          <w:p>
-            <w:r>
-              <w:rPr>
-                <w:rFonts w:ascii="Apple SD Gothic Neo" w:cs="Apple SD Gothic Neo" w:eastAsia="Apple SD Gothic Neo" w:hAnsi="Apple SD Gothic Neo"/>
-                <w:sz w:val="19"/>
-                <w:szCs w:val="19"/>
-              </w:rPr>
-              <w:t xml:space="preserve">Step 4 Claude Code</w:t>
-            </w:r>
-          </w:p>
-        </w:tc>
-        <w:tc>
-          <w:tcPr>
-            <w:tcW w:type="dxa" w:w="2000"/>
+            <w:tcW w:type="dxa" w:w="1800"/>
+            <w:tcBorders>
+              <w:top w:val="single" w:color="CCCCCC" w:sz="1"/>
+              <w:left w:val="single" w:color="CCCCCC" w:sz="1"/>
+              <w:bottom w:val="single" w:color="CCCCCC" w:sz="1"/>
+              <w:right w:val="single" w:color="CCCCCC" w:sz="1"/>
+            </w:tcBorders>
+            <w:shd w:fill="F5F8FF" w:val="clear"/>
+            <w:tcMar>
+              <w:top w:type="dxa" w:w="80"/>
+              <w:left w:type="dxa" w:w="120"/>
+              <w:bottom w:type="dxa" w:w="80"/>
+              <w:right w:type="dxa" w:w="120"/>
+            </w:tcMar>
+          </w:tcPr>
+          <w:p>
+            <w:r>
+              <w:rPr>
+                <w:rFonts w:ascii="Apple SD Gothic Neo" w:cs="Apple SD Gothic Neo" w:eastAsia="Apple SD Gothic Neo" w:hAnsi="Apple SD Gothic Neo"/>
+                <w:sz w:val="19"/>
+                <w:szCs w:val="19"/>
+              </w:rPr>
+              <w:t xml:space="preserve">Step 3 Claude Code</w:t>
+            </w:r>
+          </w:p>
+        </w:tc>
+        <w:tc>
+          <w:tcPr>
+            <w:tcW w:type="dxa" w:w="1800"/>
             <w:tcBorders>
               <w:top w:val="single" w:color="CCCCCC" w:sz="1"/>
               <w:left w:val="single" w:color="CCCCCC" w:sz="1"/>
@@ -4468,57 +4921,59 @@
         </w:tc>
         <w:tc>
           <w:tcPr>
-            <w:tcW w:type="dxa" w:w="2800"/>
-            <w:tcBorders>
-              <w:top w:val="single" w:color="CCCCCC" w:sz="1"/>
-              <w:left w:val="single" w:color="CCCCCC" w:sz="1"/>
-              <w:bottom w:val="single" w:color="CCCCCC" w:sz="1"/>
-              <w:right w:val="single" w:color="CCCCCC" w:sz="1"/>
-            </w:tcBorders>
-            <w:shd w:fill="F5F8FF" w:val="clear"/>
-            <w:tcMar>
-              <w:top w:type="dxa" w:w="80"/>
-              <w:left w:type="dxa" w:w="120"/>
-              <w:bottom w:type="dxa" w:w="80"/>
-              <w:right w:type="dxa" w:w="120"/>
-            </w:tcMar>
-          </w:tcPr>
-          <w:p>
-            <w:r>
-              <w:rPr>
-                <w:rFonts w:ascii="Apple SD Gothic Neo" w:cs="Apple SD Gothic Neo" w:eastAsia="Apple SD Gothic Neo" w:hAnsi="Apple SD Gothic Neo"/>
-                <w:sz w:val="19"/>
-                <w:szCs w:val="19"/>
-              </w:rPr>
-              <w:t xml:space="preserve">output/step4/</w:t>
-            </w:r>
-          </w:p>
-        </w:tc>
-        <w:tc>
-          <w:tcPr>
-            <w:tcW w:type="dxa" w:w="2226"/>
-            <w:tcBorders>
-              <w:top w:val="single" w:color="CCCCCC" w:sz="1"/>
-              <w:left w:val="single" w:color="CCCCCC" w:sz="1"/>
-              <w:bottom w:val="single" w:color="CCCCCC" w:sz="1"/>
-              <w:right w:val="single" w:color="CCCCCC" w:sz="1"/>
-            </w:tcBorders>
-            <w:shd w:fill="F5F8FF" w:val="clear"/>
-            <w:tcMar>
-              <w:top w:type="dxa" w:w="80"/>
-              <w:left w:type="dxa" w:w="120"/>
-              <w:bottom w:type="dxa" w:w="80"/>
-              <w:right w:type="dxa" w:w="120"/>
-            </w:tcMar>
-          </w:tcPr>
-          <w:p>
-            <w:r>
-              <w:rPr>
-                <w:rFonts w:ascii="Apple SD Gothic Neo" w:cs="Apple SD Gothic Neo" w:eastAsia="Apple SD Gothic Neo" w:hAnsi="Apple SD Gothic Neo"/>
-                <w:sz w:val="19"/>
-                <w:szCs w:val="19"/>
-              </w:rPr>
-              <w:t xml:space="preserve">로컬 실행</w:t>
+            <w:tcW w:type="dxa" w:w="2600"/>
+            <w:tcBorders>
+              <w:top w:val="single" w:color="CCCCCC" w:sz="1"/>
+              <w:left w:val="single" w:color="CCCCCC" w:sz="1"/>
+              <w:bottom w:val="single" w:color="CCCCCC" w:sz="1"/>
+              <w:right w:val="single" w:color="CCCCCC" w:sz="1"/>
+            </w:tcBorders>
+            <w:shd w:fill="F5F8FF" w:val="clear"/>
+            <w:tcMar>
+              <w:top w:type="dxa" w:w="80"/>
+              <w:left w:type="dxa" w:w="120"/>
+              <w:bottom w:type="dxa" w:w="80"/>
+              <w:right w:type="dxa" w:w="120"/>
+            </w:tcMar>
+          </w:tcPr>
+          <w:p>
+            <w:r>
+              <w:rPr>
+                <w:rFonts w:ascii="Apple SD Gothic Neo" w:cs="Apple SD Gothic Neo" w:eastAsia="Apple SD Gothic Neo" w:hAnsi="Apple SD Gothic Neo"/>
+                <w:sz w:val="19"/>
+                <w:szCs w:val="19"/>
+              </w:rPr>
+              <w:t xml:space="preserve">output/step3/$RUN_ID/
+scripts/capture.py</w:t>
+            </w:r>
+          </w:p>
+        </w:tc>
+        <w:tc>
+          <w:tcPr>
+            <w:tcW w:type="dxa" w:w="2826"/>
+            <w:tcBorders>
+              <w:top w:val="single" w:color="CCCCCC" w:sz="1"/>
+              <w:left w:val="single" w:color="CCCCCC" w:sz="1"/>
+              <w:bottom w:val="single" w:color="CCCCCC" w:sz="1"/>
+              <w:right w:val="single" w:color="CCCCCC" w:sz="1"/>
+            </w:tcBorders>
+            <w:shd w:fill="F5F8FF" w:val="clear"/>
+            <w:tcMar>
+              <w:top w:type="dxa" w:w="80"/>
+              <w:left w:type="dxa" w:w="120"/>
+              <w:bottom w:type="dxa" w:w="80"/>
+              <w:right w:type="dxa" w:w="120"/>
+            </w:tcMar>
+          </w:tcPr>
+          <w:p>
+            <w:r>
+              <w:rPr>
+                <w:rFonts w:ascii="Apple SD Gothic Neo" w:cs="Apple SD Gothic Neo" w:eastAsia="Apple SD Gothic Neo" w:hAnsi="Apple SD Gothic Neo"/>
+                <w:sz w:val="19"/>
+                <w:szCs w:val="19"/>
+              </w:rPr>
+              <w:t xml:space="preserve">Playwright 로컬 실행
+RUN_ID=$(cat output/latest_run)</w:t>
             </w:r>
           </w:p>
         </w:tc>
@@ -4526,14 +4981,129 @@
       <w:tr>
         <w:tc>
           <w:tcPr>
-            <w:tcW w:type="dxa" w:w="2000"/>
-            <w:tcBorders>
-              <w:top w:val="single" w:color="CCCCCC" w:sz="1"/>
-              <w:left w:val="single" w:color="CCCCCC" w:sz="1"/>
-              <w:bottom w:val="single" w:color="CCCCCC" w:sz="1"/>
-              <w:right w:val="single" w:color="CCCCCC" w:sz="1"/>
-            </w:tcBorders>
-            <w:shd w:fill="FFFFFF" w:val="clear"/>
+            <w:tcW w:type="dxa" w:w="1800"/>
+            <w:tcBorders>
+              <w:top w:val="single" w:color="CCCCCC" w:sz="1"/>
+              <w:left w:val="single" w:color="CCCCCC" w:sz="1"/>
+              <w:bottom w:val="single" w:color="CCCCCC" w:sz="1"/>
+              <w:right w:val="single" w:color="CCCCCC" w:sz="1"/>
+            </w:tcBorders>
+            <w:shd w:fill="FFFFFF" w:val="clear"/>
+            <w:tcMar>
+              <w:top w:type="dxa" w:w="80"/>
+              <w:left w:type="dxa" w:w="120"/>
+              <w:bottom w:type="dxa" w:w="80"/>
+              <w:right w:type="dxa" w:w="120"/>
+            </w:tcMar>
+          </w:tcPr>
+          <w:p>
+            <w:r>
+              <w:rPr>
+                <w:rFonts w:ascii="Apple SD Gothic Neo" w:cs="Apple SD Gothic Neo" w:eastAsia="Apple SD Gothic Neo" w:hAnsi="Apple SD Gothic Neo"/>
+                <w:sz w:val="19"/>
+                <w:szCs w:val="19"/>
+              </w:rPr>
+              <w:t xml:space="preserve">Step 4 Claude Code</w:t>
+            </w:r>
+          </w:p>
+        </w:tc>
+        <w:tc>
+          <w:tcPr>
+            <w:tcW w:type="dxa" w:w="1800"/>
+            <w:tcBorders>
+              <w:top w:val="single" w:color="CCCCCC" w:sz="1"/>
+              <w:left w:val="single" w:color="CCCCCC" w:sz="1"/>
+              <w:bottom w:val="single" w:color="CCCCCC" w:sz="1"/>
+              <w:right w:val="single" w:color="CCCCCC" w:sz="1"/>
+            </w:tcBorders>
+            <w:shd w:fill="FFFFFF" w:val="clear"/>
+            <w:tcMar>
+              <w:top w:type="dxa" w:w="80"/>
+              <w:left w:type="dxa" w:w="120"/>
+              <w:bottom w:type="dxa" w:w="80"/>
+              <w:right w:type="dxa" w:w="120"/>
+            </w:tcMar>
+          </w:tcPr>
+          <w:p>
+            <w:r>
+              <w:rPr>
+                <w:rFonts w:ascii="Apple SD Gothic Neo" w:cs="Apple SD Gothic Neo" w:eastAsia="Apple SD Gothic Neo" w:hAnsi="Apple SD Gothic Neo"/>
+                <w:sz w:val="19"/>
+                <w:szCs w:val="19"/>
+              </w:rPr>
+              <w:t xml:space="preserve">pull → 작업 → push</w:t>
+            </w:r>
+          </w:p>
+        </w:tc>
+        <w:tc>
+          <w:tcPr>
+            <w:tcW w:type="dxa" w:w="2600"/>
+            <w:tcBorders>
+              <w:top w:val="single" w:color="CCCCCC" w:sz="1"/>
+              <w:left w:val="single" w:color="CCCCCC" w:sz="1"/>
+              <w:bottom w:val="single" w:color="CCCCCC" w:sz="1"/>
+              <w:right w:val="single" w:color="CCCCCC" w:sz="1"/>
+            </w:tcBorders>
+            <w:shd w:fill="FFFFFF" w:val="clear"/>
+            <w:tcMar>
+              <w:top w:type="dxa" w:w="80"/>
+              <w:left w:type="dxa" w:w="120"/>
+              <w:bottom w:type="dxa" w:w="80"/>
+              <w:right w:type="dxa" w:w="120"/>
+            </w:tcMar>
+          </w:tcPr>
+          <w:p>
+            <w:r>
+              <w:rPr>
+                <w:rFonts w:ascii="Apple SD Gothic Neo" w:cs="Apple SD Gothic Neo" w:eastAsia="Apple SD Gothic Neo" w:hAnsi="Apple SD Gothic Neo"/>
+                <w:sz w:val="19"/>
+                <w:szCs w:val="19"/>
+              </w:rPr>
+              <w:t xml:space="preserve">output/step4/$RUN_ID/</w:t>
+            </w:r>
+          </w:p>
+        </w:tc>
+        <w:tc>
+          <w:tcPr>
+            <w:tcW w:type="dxa" w:w="2826"/>
+            <w:tcBorders>
+              <w:top w:val="single" w:color="CCCCCC" w:sz="1"/>
+              <w:left w:val="single" w:color="CCCCCC" w:sz="1"/>
+              <w:bottom w:val="single" w:color="CCCCCC" w:sz="1"/>
+              <w:right w:val="single" w:color="CCCCCC" w:sz="1"/>
+            </w:tcBorders>
+            <w:shd w:fill="FFFFFF" w:val="clear"/>
+            <w:tcMar>
+              <w:top w:type="dxa" w:w="80"/>
+              <w:left w:type="dxa" w:w="120"/>
+              <w:bottom w:type="dxa" w:w="80"/>
+              <w:right w:type="dxa" w:w="120"/>
+            </w:tcMar>
+          </w:tcPr>
+          <w:p>
+            <w:r>
+              <w:rPr>
+                <w:rFonts w:ascii="Apple SD Gothic Neo" w:cs="Apple SD Gothic Neo" w:eastAsia="Apple SD Gothic Neo" w:hAnsi="Apple SD Gothic Neo"/>
+                <w:sz w:val="19"/>
+                <w:szCs w:val="19"/>
+              </w:rPr>
+              <w:t xml:space="preserve">로컬 실행
+RUN_ID=$(cat output/latest_run)</w:t>
+            </w:r>
+          </w:p>
+        </w:tc>
+      </w:tr>
+      <w:tr>
+        <w:tc>
+          <w:tcPr>
+            <w:tcW w:type="dxa" w:w="1800"/>
+            <w:tcBorders>
+              <w:top w:val="single" w:color="CCCCCC" w:sz="1"/>
+              <w:left w:val="single" w:color="CCCCCC" w:sz="1"/>
+              <w:bottom w:val="single" w:color="CCCCCC" w:sz="1"/>
+              <w:right w:val="single" w:color="CCCCCC" w:sz="1"/>
+            </w:tcBorders>
+            <w:shd w:fill="F5F8FF" w:val="clear"/>
             <w:tcMar>
               <w:top w:type="dxa" w:w="80"/>
               <w:left w:type="dxa" w:w="120"/>
@@ -4554,14 +5124,14 @@
         </w:tc>
         <w:tc>
           <w:tcPr>
-            <w:tcW w:type="dxa" w:w="2000"/>
-            <w:tcBorders>
-              <w:top w:val="single" w:color="CCCCCC" w:sz="1"/>
-              <w:left w:val="single" w:color="CCCCCC" w:sz="1"/>
-              <w:bottom w:val="single" w:color="CCCCCC" w:sz="1"/>
-              <w:right w:val="single" w:color="CCCCCC" w:sz="1"/>
-            </w:tcBorders>
-            <w:shd w:fill="FFFFFF" w:val="clear"/>
+            <w:tcW w:type="dxa" w:w="1800"/>
+            <w:tcBorders>
+              <w:top w:val="single" w:color="CCCCCC" w:sz="1"/>
+              <w:left w:val="single" w:color="CCCCCC" w:sz="1"/>
+              <w:bottom w:val="single" w:color="CCCCCC" w:sz="1"/>
+              <w:right w:val="single" w:color="CCCCCC" w:sz="1"/>
+            </w:tcBorders>
+            <w:shd w:fill="F5F8FF" w:val="clear"/>
             <w:tcMar>
               <w:top w:type="dxa" w:w="80"/>
               <w:left w:type="dxa" w:w="120"/>
@@ -4582,42 +5152,42 @@
         </w:tc>
         <w:tc>
           <w:tcPr>
-            <w:tcW w:type="dxa" w:w="2800"/>
-            <w:tcBorders>
-              <w:top w:val="single" w:color="CCCCCC" w:sz="1"/>
-              <w:left w:val="single" w:color="CCCCCC" w:sz="1"/>
-              <w:bottom w:val="single" w:color="CCCCCC" w:sz="1"/>
-              <w:right w:val="single" w:color="CCCCCC" w:sz="1"/>
-            </w:tcBorders>
-            <w:shd w:fill="FFFFFF" w:val="clear"/>
-            <w:tcMar>
-              <w:top w:type="dxa" w:w="80"/>
-              <w:left w:type="dxa" w:w="120"/>
-              <w:bottom w:type="dxa" w:w="80"/>
-              <w:right w:type="dxa" w:w="120"/>
-            </w:tcMar>
-          </w:tcPr>
-          <w:p>
-            <w:r>
-              <w:rPr>
-                <w:rFonts w:ascii="Apple SD Gothic Neo" w:cs="Apple SD Gothic Neo" w:eastAsia="Apple SD Gothic Neo" w:hAnsi="Apple SD Gothic Neo"/>
-                <w:sz w:val="19"/>
-                <w:szCs w:val="19"/>
-              </w:rPr>
-              <w:t xml:space="preserve">output/step4/ 확인</w:t>
-            </w:r>
-          </w:p>
-        </w:tc>
-        <w:tc>
-          <w:tcPr>
-            <w:tcW w:type="dxa" w:w="2226"/>
-            <w:tcBorders>
-              <w:top w:val="single" w:color="CCCCCC" w:sz="1"/>
-              <w:left w:val="single" w:color="CCCCCC" w:sz="1"/>
-              <w:bottom w:val="single" w:color="CCCCCC" w:sz="1"/>
-              <w:right w:val="single" w:color="CCCCCC" w:sz="1"/>
-            </w:tcBorders>
-            <w:shd w:fill="FFFFFF" w:val="clear"/>
+            <w:tcW w:type="dxa" w:w="2600"/>
+            <w:tcBorders>
+              <w:top w:val="single" w:color="CCCCCC" w:sz="1"/>
+              <w:left w:val="single" w:color="CCCCCC" w:sz="1"/>
+              <w:bottom w:val="single" w:color="CCCCCC" w:sz="1"/>
+              <w:right w:val="single" w:color="CCCCCC" w:sz="1"/>
+            </w:tcBorders>
+            <w:shd w:fill="F5F8FF" w:val="clear"/>
+            <w:tcMar>
+              <w:top w:type="dxa" w:w="80"/>
+              <w:left w:type="dxa" w:w="120"/>
+              <w:bottom w:type="dxa" w:w="80"/>
+              <w:right w:type="dxa" w:w="120"/>
+            </w:tcMar>
+          </w:tcPr>
+          <w:p>
+            <w:r>
+              <w:rPr>
+                <w:rFonts w:ascii="Apple SD Gothic Neo" w:cs="Apple SD Gothic Neo" w:eastAsia="Apple SD Gothic Neo" w:hAnsi="Apple SD Gothic Neo"/>
+                <w:sz w:val="19"/>
+                <w:szCs w:val="19"/>
+              </w:rPr>
+              <w:t xml:space="preserve">output/step4/$RUN_ID/ 확인</w:t>
+            </w:r>
+          </w:p>
+        </w:tc>
+        <w:tc>
+          <w:tcPr>
+            <w:tcW w:type="dxa" w:w="2826"/>
+            <w:tcBorders>
+              <w:top w:val="single" w:color="CCCCCC" w:sz="1"/>
+              <w:left w:val="single" w:color="CCCCCC" w:sz="1"/>
+              <w:bottom w:val="single" w:color="CCCCCC" w:sz="1"/>
+              <w:right w:val="single" w:color="CCCCCC" w:sz="1"/>
+            </w:tcBorders>
+            <w:shd w:fill="F5F8FF" w:val="clear"/>
             <w:tcMar>
               <w:top w:type="dxa" w:w="80"/>
               <w:left w:type="dxa" w:w="120"/>

</xml_diff>